<commit_message>
corrected deleting eligibility question
</commit_message>
<xml_diff>
--- a/Testare_rezultate_1.docx
+++ b/Testare_rezultate_1.docx
@@ -11,6 +11,17 @@
         </w:numPr>
       </w:pPr>
       <w:r>
+        <w:rPr>
+          <w:b/>
+          <w:bCs/>
+          <w:highlight w:val="green"/>
+        </w:rPr>
+        <w:t>DONE</w:t>
+      </w:r>
+      <w:r>
+        <w:t xml:space="preserve"> </w:t>
+      </w:r>
+      <w:r>
         <w:t xml:space="preserve">din </w:t>
       </w:r>
       <w:proofErr w:type="spellStart"/>
@@ -381,11 +392,11 @@
         </w:numPr>
       </w:pPr>
       <w:r>
-        <w:t>la in</w:t>
-      </w:r>
-      <w:proofErr w:type="spellStart"/>
-      <w:r>
-        <w:t>registrare</w:t>
+        <w:t xml:space="preserve">la </w:t>
+      </w:r>
+      <w:proofErr w:type="spellStart"/>
+      <w:r>
+        <w:t>inregistrare</w:t>
       </w:r>
       <w:proofErr w:type="spellEnd"/>
       <w:r>
@@ -678,6 +689,9 @@
         <w:pStyle w:val="ListParagraph"/>
       </w:pPr>
       <w:r>
+        <w:rPr>
+          <w:noProof/>
+        </w:rPr>
         <w:drawing>
           <wp:inline distT="0" distB="0" distL="0" distR="0" wp14:anchorId="3F1B9F8A" wp14:editId="2FAE0B87">
             <wp:extent cx="5303520" cy="3591208"/>
@@ -2189,6 +2203,9 @@
         <w:ind w:left="2160"/>
       </w:pPr>
       <w:r>
+        <w:rPr>
+          <w:noProof/>
+        </w:rPr>
         <w:drawing>
           <wp:inline distT="0" distB="0" distL="0" distR="0" wp14:anchorId="4ED858DC" wp14:editId="1B9CF6EC">
             <wp:extent cx="3528441" cy="3360420"/>
@@ -2351,6 +2368,9 @@
         <w:ind w:left="1620"/>
       </w:pPr>
       <w:r>
+        <w:rPr>
+          <w:noProof/>
+        </w:rPr>
         <w:drawing>
           <wp:inline distT="0" distB="0" distL="0" distR="0" wp14:anchorId="1AAF7665" wp14:editId="68584F53">
             <wp:extent cx="5322714" cy="560705"/>
@@ -2445,6 +2465,9 @@
         <w:ind w:left="1080"/>
       </w:pPr>
       <w:r>
+        <w:rPr>
+          <w:noProof/>
+        </w:rPr>
         <w:drawing>
           <wp:inline distT="0" distB="0" distL="0" distR="0" wp14:anchorId="22DA5CAF" wp14:editId="6F20B605">
             <wp:extent cx="1962430" cy="2080260"/>
@@ -2846,7 +2869,15 @@
         </w:numPr>
       </w:pPr>
       <w:r>
-        <w:t xml:space="preserve">Poti nota la </w:t>
+        <w:t xml:space="preserve">Poti </w:t>
+      </w:r>
+      <w:proofErr w:type="spellStart"/>
+      <w:r>
+        <w:t>nota</w:t>
+      </w:r>
+      <w:proofErr w:type="spellEnd"/>
+      <w:r>
+        <w:t xml:space="preserve"> la </w:t>
       </w:r>
       <w:proofErr w:type="spellStart"/>
       <w:r>
@@ -2899,6 +2930,9 @@
         <w:pStyle w:val="ListParagraph"/>
       </w:pPr>
       <w:r>
+        <w:rPr>
+          <w:noProof/>
+        </w:rPr>
         <w:drawing>
           <wp:inline distT="0" distB="0" distL="0" distR="0" wp14:anchorId="2DD8FF53" wp14:editId="4AAF53EE">
             <wp:extent cx="1417320" cy="1626477"/>
@@ -3129,6 +3163,9 @@
         <w:pStyle w:val="ListParagraph"/>
       </w:pPr>
       <w:r>
+        <w:rPr>
+          <w:noProof/>
+        </w:rPr>
         <w:drawing>
           <wp:inline distT="0" distB="0" distL="0" distR="0" wp14:anchorId="6D7D41F7" wp14:editId="27BF4102">
             <wp:extent cx="2369820" cy="1659265"/>
@@ -3745,6 +3782,9 @@
         <w:ind w:left="2160"/>
       </w:pPr>
       <w:r>
+        <w:rPr>
+          <w:noProof/>
+        </w:rPr>
         <w:drawing>
           <wp:inline distT="0" distB="0" distL="0" distR="0" wp14:anchorId="53370F74" wp14:editId="74381C1F">
             <wp:extent cx="1387359" cy="1470660"/>
@@ -4580,7 +4620,7 @@
       </w:pPr>
       <w:r>
         <w:pict w14:anchorId="41CEDB14">
-          <v:rect id="_x0000_i1043" style="width:0;height:.75pt" o:hralign="center" o:hrstd="t" o:hr="t" fillcolor="#a0a0a0" stroked="f"/>
+          <v:rect id="_x0000_i1025" style="width:0;height:.75pt" o:hralign="center" o:hrstd="t" o:hr="t" fillcolor="#a0a0a0" stroked="f"/>
         </w:pict>
       </w:r>
     </w:p>
@@ -7463,7 +7503,7 @@
       </w:pPr>
       <w:r>
         <w:pict w14:anchorId="37B7561F">
-          <v:rect id="_x0000_i1044" style="width:0;height:.75pt" o:hralign="center" o:hrstd="t" o:hr="t" fillcolor="#a0a0a0" stroked="f"/>
+          <v:rect id="_x0000_i1026" style="width:0;height:.75pt" o:hralign="center" o:hrstd="t" o:hr="t" fillcolor="#a0a0a0" stroked="f"/>
         </w:pict>
       </w:r>
     </w:p>
@@ -8335,6 +8375,9 @@
         <w:pStyle w:val="ListParagraph"/>
       </w:pPr>
       <w:r>
+        <w:rPr>
+          <w:noProof/>
+        </w:rPr>
         <w:drawing>
           <wp:inline distT="0" distB="0" distL="0" distR="0" wp14:anchorId="518212A2" wp14:editId="00DF060E">
             <wp:extent cx="1946066" cy="2788920"/>
@@ -8375,6 +8418,9 @@
         <w:t xml:space="preserve"> </w:t>
       </w:r>
       <w:r>
+        <w:rPr>
+          <w:noProof/>
+        </w:rPr>
         <w:drawing>
           <wp:inline distT="0" distB="0" distL="0" distR="0" wp14:anchorId="1636AC10" wp14:editId="20E3F2C0">
             <wp:extent cx="2079814" cy="2329846"/>
@@ -8465,6 +8511,9 @@
         <w:pStyle w:val="ListParagraph"/>
       </w:pPr>
       <w:r>
+        <w:rPr>
+          <w:noProof/>
+        </w:rPr>
         <w:drawing>
           <wp:inline distT="0" distB="0" distL="0" distR="0" wp14:anchorId="59706477" wp14:editId="0136180C">
             <wp:extent cx="1181100" cy="1426833"/>
@@ -10612,6 +10661,7 @@
   <w:style w:type="character" w:default="1" w:styleId="DefaultParagraphFont">
     <w:name w:val="Default Paragraph Font"/>
     <w:uiPriority w:val="1"/>
+    <w:semiHidden/>
     <w:unhideWhenUsed/>
   </w:style>
   <w:style w:type="table" w:default="1" w:styleId="TableNormal">

</xml_diff>

<commit_message>
changes on the eligibility form
</commit_message>
<xml_diff>
--- a/Testare_rezultate_1.docx
+++ b/Testare_rezultate_1.docx
@@ -316,11 +316,22 @@
         </w:numPr>
       </w:pPr>
       <w:r>
-        <w:t xml:space="preserve">nu </w:t>
-      </w:r>
-      <w:proofErr w:type="spellStart"/>
-      <w:r>
-        <w:t>reusesc</w:t>
+        <w:rPr>
+          <w:b/>
+          <w:bCs/>
+          <w:highlight w:val="green"/>
+        </w:rPr>
+        <w:t>DONE</w:t>
+      </w:r>
+      <w:r>
+        <w:t xml:space="preserve"> </w:t>
+      </w:r>
+      <w:r>
+        <w:t>nu r</w:t>
+      </w:r>
+      <w:proofErr w:type="spellStart"/>
+      <w:r>
+        <w:t>eusesc</w:t>
       </w:r>
       <w:proofErr w:type="spellEnd"/>
       <w:r>
@@ -391,6 +402,17 @@
           <w:numId w:val="3"/>
         </w:numPr>
       </w:pPr>
+      <w:r>
+        <w:rPr>
+          <w:b/>
+          <w:bCs/>
+          <w:highlight w:val="green"/>
+        </w:rPr>
+        <w:t>DONE</w:t>
+      </w:r>
+      <w:r>
+        <w:t xml:space="preserve"> </w:t>
+      </w:r>
       <w:r>
         <w:t xml:space="preserve">la </w:t>
       </w:r>

</xml_diff>

<commit_message>
added terms and conditions on sign up
</commit_message>
<xml_diff>
--- a/Testare_rezultate_1.docx
+++ b/Testare_rezultate_1.docx
@@ -327,11 +327,11 @@
         <w:t xml:space="preserve"> </w:t>
       </w:r>
       <w:r>
-        <w:t>nu r</w:t>
-      </w:r>
-      <w:proofErr w:type="spellStart"/>
-      <w:r>
-        <w:t>eusesc</w:t>
+        <w:t xml:space="preserve">nu </w:t>
+      </w:r>
+      <w:proofErr w:type="spellStart"/>
+      <w:r>
+        <w:t>reusesc</w:t>
       </w:r>
       <w:proofErr w:type="spellEnd"/>
       <w:r>
@@ -2114,7 +2114,16 @@
         </w:numPr>
       </w:pPr>
       <w:r>
+        <w:rPr>
+          <w:highlight w:val="green"/>
+        </w:rPr>
         <w:lastRenderedPageBreak/>
+        <w:t>DONE</w:t>
+      </w:r>
+      <w:r>
+        <w:t xml:space="preserve"> </w:t>
+      </w:r>
+      <w:r>
         <w:t xml:space="preserve">La </w:t>
       </w:r>
       <w:proofErr w:type="spellStart"/>
@@ -2187,6 +2196,15 @@
           <w:numId w:val="3"/>
         </w:numPr>
       </w:pPr>
+      <w:r>
+        <w:rPr>
+          <w:highlight w:val="green"/>
+        </w:rPr>
+        <w:t>DONE</w:t>
+      </w:r>
+      <w:r>
+        <w:t xml:space="preserve"> </w:t>
+      </w:r>
       <w:proofErr w:type="spellStart"/>
       <w:r>
         <w:t>Butonul</w:t>
@@ -2273,6 +2291,15 @@
           <w:numId w:val="3"/>
         </w:numPr>
       </w:pPr>
+      <w:r>
+        <w:rPr>
+          <w:highlight w:val="green"/>
+        </w:rPr>
+        <w:t>DONE</w:t>
+      </w:r>
+      <w:r>
+        <w:t xml:space="preserve"> </w:t>
+      </w:r>
       <w:r>
         <w:t xml:space="preserve">La </w:t>
       </w:r>

</xml_diff>

<commit_message>
updated backend and db for waitlist form
</commit_message>
<xml_diff>
--- a/Testare_rezultate_1.docx
+++ b/Testare_rezultate_1.docx
@@ -577,6 +577,15 @@
           <w:numId w:val="3"/>
         </w:numPr>
       </w:pPr>
+      <w:r>
+        <w:rPr>
+          <w:highlight w:val="green"/>
+        </w:rPr>
+        <w:t>DONE</w:t>
+      </w:r>
+      <w:r>
+        <w:t xml:space="preserve"> </w:t>
+      </w:r>
       <w:proofErr w:type="spellStart"/>
       <w:r>
         <w:t>Problema</w:t>
@@ -759,6 +768,15 @@
           <w:numId w:val="3"/>
         </w:numPr>
       </w:pPr>
+      <w:r>
+        <w:rPr>
+          <w:highlight w:val="green"/>
+        </w:rPr>
+        <w:t>DONE</w:t>
+      </w:r>
+      <w:r>
+        <w:t xml:space="preserve"> </w:t>
+      </w:r>
       <w:proofErr w:type="spellStart"/>
       <w:r>
         <w:t>Probleme</w:t>
@@ -3028,6 +3046,15 @@
         </w:numPr>
       </w:pPr>
       <w:r>
+        <w:rPr>
+          <w:highlight w:val="green"/>
+        </w:rPr>
+        <w:t>DONE</w:t>
+      </w:r>
+      <w:r>
+        <w:t xml:space="preserve"> </w:t>
+      </w:r>
+      <w:r>
         <w:t xml:space="preserve">La </w:t>
       </w:r>
       <w:proofErr w:type="spellStart"/>
@@ -4077,6 +4104,15 @@
           <w:numId w:val="3"/>
         </w:numPr>
       </w:pPr>
+      <w:r>
+        <w:rPr>
+          <w:highlight w:val="green"/>
+        </w:rPr>
+        <w:t>DONE</w:t>
+      </w:r>
+      <w:r>
+        <w:t xml:space="preserve"> </w:t>
+      </w:r>
       <w:proofErr w:type="spellStart"/>
       <w:r>
         <w:t>Trebuie</w:t>

</xml_diff>

<commit_message>
updated terms and conditions
</commit_message>
<xml_diff>
--- a/Testare_rezultate_1.docx
+++ b/Testare_rezultate_1.docx
@@ -14,10 +14,42 @@
         <w:rPr>
           <w:b/>
           <w:bCs/>
+        </w:rPr>
+        <w:t xml:space="preserve">INFO:     127.0.0.1:49983 - "POST /waitlist/ HTTP/1.1" 422 </w:t>
+      </w:r>
+      <w:proofErr w:type="spellStart"/>
+      <w:r>
+        <w:rPr>
+          <w:b/>
+          <w:bCs/>
+        </w:rPr>
+        <w:t>Unprocessable</w:t>
+      </w:r>
+      <w:proofErr w:type="spellEnd"/>
+      <w:r>
+        <w:rPr>
+          <w:b/>
+          <w:bCs/>
+        </w:rPr>
+        <w:t xml:space="preserve"> </w:t>
+      </w:r>
+      <w:proofErr w:type="gramStart"/>
+      <w:r>
+        <w:rPr>
+          <w:b/>
+          <w:bCs/>
+        </w:rPr>
+        <w:t>Entity)</w:t>
+      </w:r>
+      <w:r>
+        <w:rPr>
+          <w:b/>
+          <w:bCs/>
           <w:highlight w:val="green"/>
         </w:rPr>
         <w:t>DONE</w:t>
       </w:r>
+      <w:proofErr w:type="gramEnd"/>
       <w:r>
         <w:t xml:space="preserve"> </w:t>
       </w:r>
@@ -1840,6 +1872,7 @@
           <w:i/>
           <w:iCs/>
         </w:rPr>
+        <w:lastRenderedPageBreak/>
         <w:t>starea</w:t>
       </w:r>
       <w:proofErr w:type="spellEnd"/>
@@ -2135,7 +2168,6 @@
         <w:rPr>
           <w:highlight w:val="green"/>
         </w:rPr>
-        <w:lastRenderedPageBreak/>
         <w:t>DONE</w:t>
       </w:r>
       <w:r>
@@ -2535,6 +2567,7 @@
         <w:rPr>
           <w:noProof/>
         </w:rPr>
+        <w:lastRenderedPageBreak/>
         <w:drawing>
           <wp:inline distT="0" distB="0" distL="0" distR="0" wp14:anchorId="22DA5CAF" wp14:editId="6F20B605">
             <wp:extent cx="1962430" cy="2080260"/>
@@ -2582,7 +2615,6 @@
       </w:pPr>
       <w:proofErr w:type="spellStart"/>
       <w:r>
-        <w:lastRenderedPageBreak/>
         <w:t>Numarul</w:t>
       </w:r>
       <w:proofErr w:type="spellEnd"/>
@@ -3584,6 +3616,7 @@
       </w:r>
       <w:proofErr w:type="spellStart"/>
       <w:r>
+        <w:lastRenderedPageBreak/>
         <w:t>trebuie</w:t>
       </w:r>
       <w:proofErr w:type="spellEnd"/>
@@ -3907,7 +3940,6 @@
         </w:numPr>
       </w:pPr>
       <w:r>
-        <w:lastRenderedPageBreak/>
         <w:t xml:space="preserve">Din </w:t>
       </w:r>
       <w:proofErr w:type="spellStart"/>
@@ -6141,6 +6173,7 @@
       </w:r>
       <w:proofErr w:type="spellStart"/>
       <w:r>
+        <w:lastRenderedPageBreak/>
         <w:t>dumneavoastră</w:t>
       </w:r>
       <w:proofErr w:type="spellEnd"/>
@@ -7078,7 +7111,6 @@
       </w:pPr>
       <w:proofErr w:type="spellStart"/>
       <w:r>
-        <w:lastRenderedPageBreak/>
         <w:t>În</w:t>
       </w:r>
       <w:proofErr w:type="spellEnd"/>
@@ -8463,6 +8495,7 @@
         <w:rPr>
           <w:noProof/>
         </w:rPr>
+        <w:lastRenderedPageBreak/>
         <w:drawing>
           <wp:inline distT="0" distB="0" distL="0" distR="0" wp14:anchorId="518212A2" wp14:editId="00DF060E">
             <wp:extent cx="1946066" cy="2788920"/>

</xml_diff>

<commit_message>
send mail for news
</commit_message>
<xml_diff>
--- a/Testare_rezultate_1.docx
+++ b/Testare_rezultate_1.docx
@@ -2,6 +2,63 @@
 <file path=word/document.xml><?xml version="1.0" encoding="utf-8"?>
 <w:document xmlns:wpc="http://schemas.microsoft.com/office/word/2010/wordprocessingCanvas" xmlns:cx="http://schemas.microsoft.com/office/drawing/2014/chartex" xmlns:cx1="http://schemas.microsoft.com/office/drawing/2015/9/8/chartex" xmlns:cx2="http://schemas.microsoft.com/office/drawing/2015/10/21/chartex" xmlns:cx3="http://schemas.microsoft.com/office/drawing/2016/5/9/chartex" xmlns:cx4="http://schemas.microsoft.com/office/drawing/2016/5/10/chartex" xmlns:cx5="http://schemas.microsoft.com/office/drawing/2016/5/11/chartex" xmlns:cx6="http://schemas.microsoft.com/office/drawing/2016/5/12/chartex" xmlns:cx7="http://schemas.microsoft.com/office/drawing/2016/5/13/chartex" xmlns:cx8="http://schemas.microsoft.com/office/drawing/2016/5/14/chartex" xmlns:mc="http://schemas.openxmlformats.org/markup-compatibility/2006" xmlns:aink="http://schemas.microsoft.com/office/drawing/2016/ink" xmlns:am3d="http://schemas.microsoft.com/office/drawing/2017/model3d" xmlns:o="urn:schemas-microsoft-com:office:office" xmlns:oel="http://schemas.microsoft.com/office/2019/extlst" xmlns:r="http://schemas.openxmlformats.org/officeDocument/2006/relationships" xmlns:m="http://schemas.openxmlformats.org/officeDocument/2006/math" xmlns:v="urn:schemas-microsoft-com:vml" xmlns:wp14="http://schemas.microsoft.com/office/word/2010/wordprocessingDrawing" xmlns:wp="http://schemas.openxmlformats.org/drawingml/2006/wordprocessingDrawing" xmlns:w10="urn:schemas-microsoft-com:office:word" xmlns:w="http://schemas.openxmlformats.org/wordprocessingml/2006/main" xmlns:w14="http://schemas.microsoft.com/office/word/2010/wordml" xmlns:w15="http://schemas.microsoft.com/office/word/2012/wordml" xmlns:w16cex="http://schemas.microsoft.com/office/word/2018/wordml/cex" xmlns:w16cid="http://schemas.microsoft.com/office/word/2016/wordml/cid" xmlns:w16="http://schemas.microsoft.com/office/word/2018/wordml" xmlns:w16du="http://schemas.microsoft.com/office/word/2023/wordml/word16du" xmlns:w16sdtdh="http://schemas.microsoft.com/office/word/2020/wordml/sdtdatahash" xmlns:w16sdtfl="http://schemas.microsoft.com/office/word/2024/wordml/sdtformatlock" xmlns:w16se="http://schemas.microsoft.com/office/word/2015/wordml/symex" xmlns:wpg="http://schemas.microsoft.com/office/word/2010/wordprocessingGroup" xmlns:wpi="http://schemas.microsoft.com/office/word/2010/wordprocessingInk" xmlns:wne="http://schemas.microsoft.com/office/word/2006/wordml" xmlns:wps="http://schemas.microsoft.com/office/word/2010/wordprocessingShape" mc:Ignorable="w14 w15 w16se w16cid w16 w16cex w16sdtdh w16sdtfl w16du wp14">
   <w:body>
+    <w:p>
+      <w:pPr>
+        <w:ind w:left="720" w:hanging="360"/>
+      </w:pPr>
+    </w:p>
+    <w:p>
+      <w:pPr>
+        <w:pStyle w:val="ListParagraph"/>
+      </w:pPr>
+      <w:r>
+        <w:drawing>
+          <wp:inline distT="0" distB="0" distL="0" distR="0" wp14:anchorId="471195C4" wp14:editId="6B3197EB">
+            <wp:extent cx="5943600" cy="1511300"/>
+            <wp:effectExtent l="0" t="0" r="0" b="0"/>
+            <wp:docPr id="1357470120" name="Picture 1"/>
+            <wp:cNvGraphicFramePr>
+              <a:graphicFrameLocks xmlns:a="http://schemas.openxmlformats.org/drawingml/2006/main" noChangeAspect="1"/>
+            </wp:cNvGraphicFramePr>
+            <a:graphic xmlns:a="http://schemas.openxmlformats.org/drawingml/2006/main">
+              <a:graphicData uri="http://schemas.openxmlformats.org/drawingml/2006/picture">
+                <pic:pic xmlns:pic="http://schemas.openxmlformats.org/drawingml/2006/picture">
+                  <pic:nvPicPr>
+                    <pic:cNvPr id="1357470120" name=""/>
+                    <pic:cNvPicPr/>
+                  </pic:nvPicPr>
+                  <pic:blipFill>
+                    <a:blip r:embed="rId5"/>
+                    <a:stretch>
+                      <a:fillRect/>
+                    </a:stretch>
+                  </pic:blipFill>
+                  <pic:spPr>
+                    <a:xfrm>
+                      <a:off x="0" y="0"/>
+                      <a:ext cx="5943600" cy="1511300"/>
+                    </a:xfrm>
+                    <a:prstGeom prst="rect">
+                      <a:avLst/>
+                    </a:prstGeom>
+                  </pic:spPr>
+                </pic:pic>
+              </a:graphicData>
+            </a:graphic>
+          </wp:inline>
+        </w:drawing>
+      </w:r>
+    </w:p>
+    <w:p>
+      <w:pPr>
+        <w:pStyle w:val="ListParagraph"/>
+      </w:pPr>
+    </w:p>
+    <w:p>
+      <w:pPr>
+        <w:pStyle w:val="ListParagraph"/>
+      </w:pPr>
+    </w:p>
     <w:p>
       <w:pPr>
         <w:pStyle w:val="ListParagraph"/>
@@ -771,7 +828,7 @@
                     <pic:cNvPicPr/>
                   </pic:nvPicPr>
                   <pic:blipFill>
-                    <a:blip r:embed="rId5"/>
+                    <a:blip r:embed="rId6"/>
                     <a:stretch>
                       <a:fillRect/>
                     </a:stretch>
@@ -804,6 +861,7 @@
         <w:rPr>
           <w:highlight w:val="green"/>
         </w:rPr>
+        <w:lastRenderedPageBreak/>
         <w:t>DONE</w:t>
       </w:r>
       <w:r>
@@ -1872,7 +1930,6 @@
           <w:i/>
           <w:iCs/>
         </w:rPr>
-        <w:lastRenderedPageBreak/>
         <w:t>starea</w:t>
       </w:r>
       <w:proofErr w:type="spellEnd"/>
@@ -2312,7 +2369,7 @@
                     <pic:cNvPicPr/>
                   </pic:nvPicPr>
                   <pic:blipFill>
-                    <a:blip r:embed="rId6"/>
+                    <a:blip r:embed="rId7"/>
                     <a:stretch>
                       <a:fillRect/>
                     </a:stretch>
@@ -2486,7 +2543,7 @@
                     <pic:cNvPicPr/>
                   </pic:nvPicPr>
                   <pic:blipFill>
-                    <a:blip r:embed="rId7"/>
+                    <a:blip r:embed="rId8"/>
                     <a:stretch>
                       <a:fillRect/>
                     </a:stretch>
@@ -2584,7 +2641,7 @@
                     <pic:cNvPicPr/>
                   </pic:nvPicPr>
                   <pic:blipFill>
-                    <a:blip r:embed="rId8"/>
+                    <a:blip r:embed="rId9"/>
                     <a:stretch>
                       <a:fillRect/>
                     </a:stretch>
@@ -3048,7 +3105,7 @@
                     <pic:cNvPicPr/>
                   </pic:nvPicPr>
                   <pic:blipFill>
-                    <a:blip r:embed="rId9"/>
+                    <a:blip r:embed="rId10"/>
                     <a:stretch>
                       <a:fillRect/>
                     </a:stretch>
@@ -3290,7 +3347,7 @@
                     <pic:cNvPicPr/>
                   </pic:nvPicPr>
                   <pic:blipFill>
-                    <a:blip r:embed="rId10"/>
+                    <a:blip r:embed="rId11"/>
                     <a:stretch>
                       <a:fillRect/>
                     </a:stretch>
@@ -3320,6 +3377,15 @@
         </w:numPr>
       </w:pPr>
       <w:r>
+        <w:rPr>
+          <w:highlight w:val="green"/>
+        </w:rPr>
+        <w:t>DONE</w:t>
+      </w:r>
+      <w:r>
+        <w:t xml:space="preserve"> </w:t>
+      </w:r>
+      <w:r>
         <w:t xml:space="preserve">Oare nu </w:t>
       </w:r>
       <w:proofErr w:type="spellStart"/>
@@ -3389,6 +3455,15 @@
           <w:numId w:val="3"/>
         </w:numPr>
       </w:pPr>
+      <w:r>
+        <w:rPr>
+          <w:highlight w:val="green"/>
+        </w:rPr>
+        <w:t>DONE</w:t>
+      </w:r>
+      <w:r>
+        <w:t xml:space="preserve"> </w:t>
+      </w:r>
       <w:r>
         <w:t xml:space="preserve">Daca </w:t>
       </w:r>
@@ -3910,7 +3985,7 @@
                     <pic:cNvPicPr/>
                   </pic:nvPicPr>
                   <pic:blipFill>
-                    <a:blip r:embed="rId8"/>
+                    <a:blip r:embed="rId9"/>
                     <a:stretch>
                       <a:fillRect/>
                     </a:stretch>
@@ -8512,7 +8587,7 @@
                     <pic:cNvPicPr/>
                   </pic:nvPicPr>
                   <pic:blipFill>
-                    <a:blip r:embed="rId11"/>
+                    <a:blip r:embed="rId12"/>
                     <a:stretch>
                       <a:fillRect/>
                     </a:stretch>
@@ -8555,7 +8630,7 @@
                     <pic:cNvPicPr/>
                   </pic:nvPicPr>
                   <pic:blipFill>
-                    <a:blip r:embed="rId12"/>
+                    <a:blip r:embed="rId13"/>
                     <a:stretch>
                       <a:fillRect/>
                     </a:stretch>
@@ -8648,7 +8723,7 @@
                     <pic:cNvPicPr/>
                   </pic:nvPicPr>
                   <pic:blipFill>
-                    <a:blip r:embed="rId13"/>
+                    <a:blip r:embed="rId14"/>
                     <a:stretch>
                       <a:fillRect/>
                     </a:stretch>
@@ -10779,7 +10854,6 @@
   <w:style w:type="character" w:default="1" w:styleId="DefaultParagraphFont">
     <w:name w:val="Default Paragraph Font"/>
     <w:uiPriority w:val="1"/>
-    <w:semiHidden/>
     <w:unhideWhenUsed/>
   </w:style>
   <w:style w:type="table" w:default="1" w:styleId="TableNormal">

</xml_diff>

<commit_message>
cannot do more than 1 appiontment
</commit_message>
<xml_diff>
--- a/Testare_rezultate_1.docx
+++ b/Testare_rezultate_1.docx
@@ -12,6 +12,9 @@
         <w:pStyle w:val="ListParagraph"/>
       </w:pPr>
       <w:r>
+        <w:rPr>
+          <w:noProof/>
+        </w:rPr>
         <w:drawing>
           <wp:inline distT="0" distB="0" distL="0" distR="0" wp14:anchorId="471195C4" wp14:editId="6B3197EB">
             <wp:extent cx="5943600" cy="1511300"/>
@@ -2670,6 +2673,15 @@
           <w:numId w:val="3"/>
         </w:numPr>
       </w:pPr>
+      <w:r>
+        <w:rPr>
+          <w:highlight w:val="green"/>
+        </w:rPr>
+        <w:t>DONE</w:t>
+      </w:r>
+      <w:r>
+        <w:t xml:space="preserve"> </w:t>
+      </w:r>
       <w:proofErr w:type="spellStart"/>
       <w:r>
         <w:t>Numarul</w:t>
@@ -10854,6 +10866,7 @@
   <w:style w:type="character" w:default="1" w:styleId="DefaultParagraphFont">
     <w:name w:val="Default Paragraph Font"/>
     <w:uiPriority w:val="1"/>
+    <w:semiHidden/>
     <w:unhideWhenUsed/>
   </w:style>
   <w:style w:type="table" w:default="1" w:styleId="TableNormal">

</xml_diff>

<commit_message>
updated appointment for someone else logic
</commit_message>
<xml_diff>
--- a/Testare_rezultate_1.docx
+++ b/Testare_rezultate_1.docx
@@ -10,30 +10,313 @@
           <w:numId w:val="15"/>
         </w:numPr>
       </w:pPr>
-      <w:proofErr w:type="spellStart"/>
-      <w:r>
-        <w:t>Politica</w:t>
-      </w:r>
-      <w:proofErr w:type="spellEnd"/>
-      <w:r>
+      <w:r>
+        <w:rPr>
+          <w:b/>
+          <w:bCs/>
+          <w:color w:val="EE0000"/>
+        </w:rPr>
+        <w:t xml:space="preserve">Credit </w:t>
+      </w:r>
+      <w:proofErr w:type="spellStart"/>
+      <w:r>
+        <w:rPr>
+          <w:b/>
+          <w:bCs/>
+          <w:color w:val="EE0000"/>
+        </w:rPr>
+        <w:t>pentru</w:t>
+      </w:r>
+      <w:proofErr w:type="spellEnd"/>
+      <w:r>
+        <w:rPr>
+          <w:b/>
+          <w:bCs/>
+          <w:color w:val="EE0000"/>
+        </w:rPr>
+        <w:t xml:space="preserve"> </w:t>
+      </w:r>
+      <w:proofErr w:type="spellStart"/>
+      <w:r>
+        <w:rPr>
+          <w:b/>
+          <w:bCs/>
+          <w:color w:val="EE0000"/>
+        </w:rPr>
+        <w:t>portofoliul</w:t>
+      </w:r>
+      <w:proofErr w:type="spellEnd"/>
+      <w:r>
+        <w:rPr>
+          <w:b/>
+          <w:bCs/>
+          <w:color w:val="EE0000"/>
+        </w:rPr>
+        <w:t xml:space="preserve"> </w:t>
+      </w:r>
+      <w:proofErr w:type="spellStart"/>
+      <w:r>
+        <w:rPr>
+          <w:b/>
+          <w:bCs/>
+          <w:color w:val="EE0000"/>
+        </w:rPr>
+        <w:t>tauȘ</w:t>
+      </w:r>
+      <w:proofErr w:type="spellEnd"/>
+      <w:r>
+        <w:rPr>
+          <w:b/>
+          <w:bCs/>
+          <w:color w:val="EE0000"/>
+        </w:rPr>
+        <w:t xml:space="preserve"> in </w:t>
+      </w:r>
+      <w:proofErr w:type="spellStart"/>
+      <w:r>
+        <w:rPr>
+          <w:b/>
+          <w:bCs/>
+          <w:color w:val="EE0000"/>
+        </w:rPr>
+        <w:t>pagina</w:t>
+      </w:r>
+      <w:proofErr w:type="spellEnd"/>
+      <w:r>
+        <w:rPr>
+          <w:b/>
+          <w:bCs/>
+          <w:color w:val="EE0000"/>
+        </w:rPr>
         <w:t xml:space="preserve"> de </w:t>
       </w:r>
       <w:proofErr w:type="spellStart"/>
       <w:r>
-        <w:t>confidetnialitate</w:t>
-      </w:r>
-      <w:proofErr w:type="spellEnd"/>
-      <w:r>
-        <w:t xml:space="preserve"> ---- </w:t>
-      </w:r>
-      <w:proofErr w:type="spellStart"/>
-      <w:r>
-        <w:t>lipseste</w:t>
-      </w:r>
-      <w:proofErr w:type="spellEnd"/>
-      <w:r>
-        <w:t xml:space="preserve"> SCROLL UP/DOWN</w:t>
-      </w:r>
+        <w:rPr>
+          <w:b/>
+          <w:bCs/>
+          <w:color w:val="EE0000"/>
+        </w:rPr>
+        <w:t>autentificare</w:t>
+      </w:r>
+      <w:proofErr w:type="spellEnd"/>
+      <w:r>
+        <w:rPr>
+          <w:b/>
+          <w:bCs/>
+          <w:color w:val="EE0000"/>
+        </w:rPr>
+        <w:t xml:space="preserve"> </w:t>
+      </w:r>
+      <w:proofErr w:type="spellStart"/>
+      <w:r>
+        <w:rPr>
+          <w:b/>
+          <w:bCs/>
+          <w:color w:val="EE0000"/>
+        </w:rPr>
+        <w:t>chatgpt</w:t>
+      </w:r>
+      <w:proofErr w:type="spellEnd"/>
+      <w:r>
+        <w:rPr>
+          <w:b/>
+          <w:bCs/>
+          <w:color w:val="EE0000"/>
+        </w:rPr>
+        <w:t xml:space="preserve"> </w:t>
+      </w:r>
+      <w:proofErr w:type="spellStart"/>
+      <w:r>
+        <w:rPr>
+          <w:b/>
+          <w:bCs/>
+          <w:color w:val="EE0000"/>
+        </w:rPr>
+        <w:t>propune</w:t>
+      </w:r>
+      <w:proofErr w:type="spellEnd"/>
+      <w:r>
+        <w:rPr>
+          <w:b/>
+          <w:bCs/>
+          <w:color w:val="EE0000"/>
+        </w:rPr>
+        <w:t xml:space="preserve"> </w:t>
+      </w:r>
+      <w:proofErr w:type="spellStart"/>
+      <w:r>
+        <w:rPr>
+          <w:b/>
+          <w:bCs/>
+          <w:color w:val="EE0000"/>
+        </w:rPr>
+        <w:t>sa</w:t>
+      </w:r>
+      <w:proofErr w:type="spellEnd"/>
+      <w:r>
+        <w:rPr>
+          <w:b/>
+          <w:bCs/>
+          <w:color w:val="EE0000"/>
+        </w:rPr>
+        <w:t xml:space="preserve"> </w:t>
+      </w:r>
+      <w:proofErr w:type="spellStart"/>
+      <w:r>
+        <w:rPr>
+          <w:b/>
+          <w:bCs/>
+          <w:color w:val="EE0000"/>
+        </w:rPr>
+        <w:t>scrii</w:t>
+      </w:r>
+      <w:proofErr w:type="spellEnd"/>
+      <w:r>
+        <w:rPr>
+          <w:b/>
+          <w:bCs/>
+          <w:color w:val="EE0000"/>
+        </w:rPr>
+        <w:t xml:space="preserve"> </w:t>
+      </w:r>
+      <w:proofErr w:type="spellStart"/>
+      <w:r>
+        <w:rPr>
+          <w:b/>
+          <w:bCs/>
+          <w:color w:val="EE0000"/>
+        </w:rPr>
+        <w:t>asta</w:t>
+      </w:r>
+      <w:proofErr w:type="spellEnd"/>
+      <w:r>
+        <w:rPr>
+          <w:b/>
+          <w:bCs/>
+          <w:color w:val="EE0000"/>
+        </w:rPr>
+        <w:t>,</w:t>
+      </w:r>
+      <w:r>
+        <w:rPr>
+          <w:color w:val="EE0000"/>
+        </w:rPr>
+        <w:t xml:space="preserve"> </w:t>
+      </w:r>
+      <w:r>
+        <w:t xml:space="preserve">eventual </w:t>
+      </w:r>
+      <w:proofErr w:type="spellStart"/>
+      <w:r>
+        <w:t>ȚDumbravita</w:t>
+      </w:r>
+      <w:proofErr w:type="spellEnd"/>
+      <w:r>
+        <w:t xml:space="preserve"> </w:t>
+      </w:r>
+      <w:proofErr w:type="spellStart"/>
+      <w:r>
+        <w:t>Salveaza</w:t>
+      </w:r>
+      <w:proofErr w:type="spellEnd"/>
+      <w:r>
+        <w:t xml:space="preserve"> </w:t>
+      </w:r>
+      <w:proofErr w:type="spellStart"/>
+      <w:r>
+        <w:t>VietiȚ</w:t>
+      </w:r>
+      <w:proofErr w:type="spellEnd"/>
+      <w:r>
+        <w:t xml:space="preserve"> </w:t>
+      </w:r>
+      <w:proofErr w:type="spellStart"/>
+      <w:r>
+        <w:t>poate</w:t>
+      </w:r>
+      <w:proofErr w:type="spellEnd"/>
+      <w:r>
+        <w:t xml:space="preserve"> fi un link </w:t>
+      </w:r>
+      <w:proofErr w:type="spellStart"/>
+      <w:r>
+        <w:t>catre</w:t>
+      </w:r>
+      <w:proofErr w:type="spellEnd"/>
+      <w:r>
+        <w:t xml:space="preserve"> </w:t>
+      </w:r>
+      <w:proofErr w:type="spellStart"/>
+      <w:r>
+        <w:t>pagina</w:t>
+      </w:r>
+      <w:proofErr w:type="spellEnd"/>
+      <w:r>
+        <w:t xml:space="preserve"> </w:t>
+      </w:r>
+      <w:proofErr w:type="spellStart"/>
+      <w:r>
+        <w:t>ei</w:t>
+      </w:r>
+      <w:proofErr w:type="spellEnd"/>
+      <w:r>
+        <w:t xml:space="preserve"> de f</w:t>
+      </w:r>
+      <w:proofErr w:type="spellStart"/>
+      <w:r>
+        <w:t>acebook</w:t>
+      </w:r>
+      <w:proofErr w:type="spellEnd"/>
+    </w:p>
+    <w:p>
+      <w:pPr>
+        <w:pStyle w:val="ListParagraph"/>
+        <w:jc w:val="center"/>
+      </w:pPr>
+      <w:r>
+        <w:drawing>
+          <wp:inline distT="0" distB="0" distL="0" distR="0" wp14:anchorId="6AEABF73" wp14:editId="175B04C7">
+            <wp:extent cx="3499751" cy="3680460"/>
+            <wp:effectExtent l="0" t="0" r="5715" b="0"/>
+            <wp:docPr id="979107684" name="Picture 1"/>
+            <wp:cNvGraphicFramePr>
+              <a:graphicFrameLocks xmlns:a="http://schemas.openxmlformats.org/drawingml/2006/main" noChangeAspect="1"/>
+            </wp:cNvGraphicFramePr>
+            <a:graphic xmlns:a="http://schemas.openxmlformats.org/drawingml/2006/main">
+              <a:graphicData uri="http://schemas.openxmlformats.org/drawingml/2006/picture">
+                <pic:pic xmlns:pic="http://schemas.openxmlformats.org/drawingml/2006/picture">
+                  <pic:nvPicPr>
+                    <pic:cNvPr id="979107684" name=""/>
+                    <pic:cNvPicPr/>
+                  </pic:nvPicPr>
+                  <pic:blipFill>
+                    <a:blip r:embed="rId5"/>
+                    <a:stretch>
+                      <a:fillRect/>
+                    </a:stretch>
+                  </pic:blipFill>
+                  <pic:spPr>
+                    <a:xfrm>
+                      <a:off x="0" y="0"/>
+                      <a:ext cx="3503761" cy="3684677"/>
+                    </a:xfrm>
+                    <a:prstGeom prst="rect">
+                      <a:avLst/>
+                    </a:prstGeom>
+                  </pic:spPr>
+                </pic:pic>
+              </a:graphicData>
+            </a:graphic>
+          </wp:inline>
+        </w:drawing>
+      </w:r>
+    </w:p>
+    <w:p>
+      <w:pPr>
+        <w:pStyle w:val="ListParagraph"/>
+        <w:jc w:val="center"/>
+      </w:pPr>
     </w:p>
     <w:p>
       <w:pPr>
@@ -42,7 +325,2366 @@
           <w:ilvl w:val="0"/>
           <w:numId w:val="15"/>
         </w:numPr>
-      </w:pPr>
+        <w:rPr>
+          <w:b/>
+          <w:bCs/>
+          <w:color w:val="EE0000"/>
+          <w:u w:val="single"/>
+        </w:rPr>
+      </w:pPr>
+      <w:r>
+        <w:rPr>
+          <w:b/>
+          <w:bCs/>
+          <w:color w:val="EE0000"/>
+          <w:u w:val="single"/>
+        </w:rPr>
+        <w:t xml:space="preserve">Pe </w:t>
+      </w:r>
+      <w:proofErr w:type="spellStart"/>
+      <w:r>
+        <w:rPr>
+          <w:b/>
+          <w:bCs/>
+          <w:color w:val="EE0000"/>
+          <w:u w:val="single"/>
+        </w:rPr>
+        <w:t>pagina</w:t>
+      </w:r>
+      <w:proofErr w:type="spellEnd"/>
+      <w:r>
+        <w:rPr>
+          <w:b/>
+          <w:bCs/>
+          <w:color w:val="EE0000"/>
+          <w:u w:val="single"/>
+        </w:rPr>
+        <w:t xml:space="preserve"> </w:t>
+      </w:r>
+      <w:proofErr w:type="spellStart"/>
+      <w:r>
+        <w:rPr>
+          <w:b/>
+          <w:bCs/>
+          <w:color w:val="EE0000"/>
+          <w:u w:val="single"/>
+        </w:rPr>
+        <w:t>conturilor</w:t>
+      </w:r>
+      <w:proofErr w:type="spellEnd"/>
+      <w:r>
+        <w:rPr>
+          <w:b/>
+          <w:bCs/>
+          <w:color w:val="EE0000"/>
+          <w:u w:val="single"/>
+        </w:rPr>
+        <w:t xml:space="preserve">, in </w:t>
+      </w:r>
+      <w:proofErr w:type="spellStart"/>
+      <w:r>
+        <w:rPr>
+          <w:b/>
+          <w:bCs/>
+          <w:color w:val="EE0000"/>
+          <w:u w:val="single"/>
+        </w:rPr>
+        <w:t>partea</w:t>
+      </w:r>
+      <w:proofErr w:type="spellEnd"/>
+      <w:r>
+        <w:rPr>
+          <w:b/>
+          <w:bCs/>
+          <w:color w:val="EE0000"/>
+          <w:u w:val="single"/>
+        </w:rPr>
+        <w:t xml:space="preserve"> de </w:t>
+      </w:r>
+      <w:proofErr w:type="spellStart"/>
+      <w:r>
+        <w:rPr>
+          <w:b/>
+          <w:bCs/>
+          <w:color w:val="EE0000"/>
+          <w:u w:val="single"/>
+        </w:rPr>
+        <w:t>jos</w:t>
+      </w:r>
+      <w:proofErr w:type="spellEnd"/>
+      <w:r>
+        <w:rPr>
+          <w:b/>
+          <w:bCs/>
+          <w:color w:val="EE0000"/>
+          <w:u w:val="single"/>
+        </w:rPr>
+        <w:t xml:space="preserve"> … cam </w:t>
+      </w:r>
+      <w:proofErr w:type="spellStart"/>
+      <w:r>
+        <w:rPr>
+          <w:b/>
+          <w:bCs/>
+          <w:color w:val="EE0000"/>
+          <w:u w:val="single"/>
+        </w:rPr>
+        <w:t>unde</w:t>
+      </w:r>
+      <w:proofErr w:type="spellEnd"/>
+      <w:r>
+        <w:rPr>
+          <w:b/>
+          <w:bCs/>
+          <w:color w:val="EE0000"/>
+          <w:u w:val="single"/>
+        </w:rPr>
+        <w:t xml:space="preserve"> am </w:t>
+      </w:r>
+      <w:proofErr w:type="spellStart"/>
+      <w:r>
+        <w:rPr>
+          <w:b/>
+          <w:bCs/>
+          <w:color w:val="EE0000"/>
+          <w:u w:val="single"/>
+        </w:rPr>
+        <w:t>psu</w:t>
+      </w:r>
+      <w:proofErr w:type="spellEnd"/>
+      <w:r>
+        <w:rPr>
+          <w:b/>
+          <w:bCs/>
+          <w:color w:val="EE0000"/>
+          <w:u w:val="single"/>
+        </w:rPr>
+        <w:t xml:space="preserve"> </w:t>
+      </w:r>
+      <w:proofErr w:type="spellStart"/>
+      <w:r>
+        <w:rPr>
+          <w:b/>
+          <w:bCs/>
+          <w:color w:val="EE0000"/>
+          <w:u w:val="single"/>
+        </w:rPr>
+        <w:t>galben</w:t>
+      </w:r>
+      <w:proofErr w:type="spellEnd"/>
+    </w:p>
+    <w:p>
+      <w:pPr>
+        <w:pStyle w:val="x1ghz6dp"/>
+        <w:shd w:val="clear" w:color="auto" w:fill="FCFCFC"/>
+        <w:spacing w:before="0" w:beforeAutospacing="0" w:after="0" w:afterAutospacing="0"/>
+        <w:ind w:left="1440"/>
+        <w:rPr>
+          <w:rFonts w:ascii="Segoe UI" w:hAnsi="Segoe UI" w:cs="Segoe UI"/>
+          <w:b/>
+          <w:bCs/>
+          <w:color w:val="5D5D5D"/>
+        </w:rPr>
+      </w:pPr>
+      <w:r>
+        <w:rPr>
+          <w:rFonts w:ascii="Segoe UI" w:hAnsi="Segoe UI" w:cs="Segoe UI"/>
+          <w:b/>
+          <w:bCs/>
+          <w:color w:val="5D5D5D"/>
+        </w:rPr>
+        <w:t xml:space="preserve">© 2026 </w:t>
+      </w:r>
+      <w:proofErr w:type="spellStart"/>
+      <w:r>
+        <w:rPr>
+          <w:rFonts w:ascii="Segoe UI" w:hAnsi="Segoe UI" w:cs="Segoe UI"/>
+          <w:b/>
+          <w:bCs/>
+          <w:color w:val="5D5D5D"/>
+        </w:rPr>
+        <w:t>Dumbrăvița</w:t>
+      </w:r>
+      <w:proofErr w:type="spellEnd"/>
+      <w:r>
+        <w:rPr>
+          <w:rFonts w:ascii="Segoe UI" w:hAnsi="Segoe UI" w:cs="Segoe UI"/>
+          <w:b/>
+          <w:bCs/>
+          <w:color w:val="5D5D5D"/>
+        </w:rPr>
+        <w:t xml:space="preserve"> </w:t>
+      </w:r>
+      <w:proofErr w:type="spellStart"/>
+      <w:r>
+        <w:rPr>
+          <w:rFonts w:ascii="Segoe UI" w:hAnsi="Segoe UI" w:cs="Segoe UI"/>
+          <w:b/>
+          <w:bCs/>
+          <w:color w:val="5D5D5D"/>
+        </w:rPr>
+        <w:t>Salvează</w:t>
+      </w:r>
+      <w:proofErr w:type="spellEnd"/>
+      <w:r>
+        <w:rPr>
+          <w:rFonts w:ascii="Segoe UI" w:hAnsi="Segoe UI" w:cs="Segoe UI"/>
+          <w:b/>
+          <w:bCs/>
+          <w:color w:val="5D5D5D"/>
+        </w:rPr>
+        <w:t xml:space="preserve"> </w:t>
+      </w:r>
+      <w:proofErr w:type="spellStart"/>
+      <w:r>
+        <w:rPr>
+          <w:rFonts w:ascii="Segoe UI" w:hAnsi="Segoe UI" w:cs="Segoe UI"/>
+          <w:b/>
+          <w:bCs/>
+          <w:color w:val="5D5D5D"/>
+        </w:rPr>
+        <w:t>Vieți</w:t>
+      </w:r>
+      <w:proofErr w:type="spellEnd"/>
+    </w:p>
+    <w:p>
+      <w:pPr>
+        <w:pStyle w:val="x1ghz6dp"/>
+        <w:shd w:val="clear" w:color="auto" w:fill="FCFCFC"/>
+        <w:spacing w:before="0" w:beforeAutospacing="0" w:after="0" w:afterAutospacing="0"/>
+        <w:ind w:left="1440"/>
+        <w:rPr>
+          <w:rFonts w:ascii="Segoe UI" w:hAnsi="Segoe UI" w:cs="Segoe UI"/>
+          <w:b/>
+          <w:bCs/>
+          <w:color w:val="5D5D5D"/>
+        </w:rPr>
+      </w:pPr>
+      <w:proofErr w:type="spellStart"/>
+      <w:r>
+        <w:rPr>
+          <w:rFonts w:ascii="Segoe UI" w:hAnsi="Segoe UI" w:cs="Segoe UI"/>
+          <w:b/>
+          <w:bCs/>
+          <w:color w:val="5D5D5D"/>
+        </w:rPr>
+        <w:t>Dezvoltat</w:t>
+      </w:r>
+      <w:proofErr w:type="spellEnd"/>
+      <w:r>
+        <w:rPr>
+          <w:rFonts w:ascii="Segoe UI" w:hAnsi="Segoe UI" w:cs="Segoe UI"/>
+          <w:b/>
+          <w:bCs/>
+          <w:color w:val="5D5D5D"/>
+        </w:rPr>
+        <w:t xml:space="preserve"> de [</w:t>
+      </w:r>
+      <w:proofErr w:type="spellStart"/>
+      <w:r>
+        <w:rPr>
+          <w:rFonts w:ascii="Segoe UI" w:hAnsi="Segoe UI" w:cs="Segoe UI"/>
+          <w:b/>
+          <w:bCs/>
+          <w:color w:val="5D5D5D"/>
+        </w:rPr>
+        <w:t>Numele</w:t>
+      </w:r>
+      <w:proofErr w:type="spellEnd"/>
+      <w:r>
+        <w:rPr>
+          <w:rFonts w:ascii="Segoe UI" w:hAnsi="Segoe UI" w:cs="Segoe UI"/>
+          <w:b/>
+          <w:bCs/>
+          <w:color w:val="5D5D5D"/>
+        </w:rPr>
+        <w:t xml:space="preserve"> </w:t>
+      </w:r>
+      <w:proofErr w:type="spellStart"/>
+      <w:r>
+        <w:rPr>
+          <w:rFonts w:ascii="Segoe UI" w:hAnsi="Segoe UI" w:cs="Segoe UI"/>
+          <w:b/>
+          <w:bCs/>
+          <w:color w:val="5D5D5D"/>
+        </w:rPr>
+        <w:t>Tău</w:t>
+      </w:r>
+      <w:proofErr w:type="spellEnd"/>
+      <w:r>
+        <w:rPr>
+          <w:rFonts w:ascii="Segoe UI" w:hAnsi="Segoe UI" w:cs="Segoe UI"/>
+          <w:b/>
+          <w:bCs/>
+          <w:color w:val="5D5D5D"/>
+        </w:rPr>
+        <w:t xml:space="preserve">], </w:t>
+      </w:r>
+      <w:proofErr w:type="spellStart"/>
+      <w:r>
+        <w:rPr>
+          <w:rFonts w:ascii="Segoe UI" w:hAnsi="Segoe UI" w:cs="Segoe UI"/>
+          <w:b/>
+          <w:bCs/>
+          <w:color w:val="5D5D5D"/>
+        </w:rPr>
+        <w:t>în</w:t>
+      </w:r>
+      <w:proofErr w:type="spellEnd"/>
+      <w:r>
+        <w:rPr>
+          <w:rFonts w:ascii="Segoe UI" w:hAnsi="Segoe UI" w:cs="Segoe UI"/>
+          <w:b/>
+          <w:bCs/>
+          <w:color w:val="5D5D5D"/>
+        </w:rPr>
+        <w:t xml:space="preserve"> </w:t>
+      </w:r>
+      <w:proofErr w:type="spellStart"/>
+      <w:r>
+        <w:rPr>
+          <w:rFonts w:ascii="Segoe UI" w:hAnsi="Segoe UI" w:cs="Segoe UI"/>
+          <w:b/>
+          <w:bCs/>
+          <w:color w:val="5D5D5D"/>
+        </w:rPr>
+        <w:t>regim</w:t>
+      </w:r>
+      <w:proofErr w:type="spellEnd"/>
+      <w:r>
+        <w:rPr>
+          <w:rFonts w:ascii="Segoe UI" w:hAnsi="Segoe UI" w:cs="Segoe UI"/>
+          <w:b/>
+          <w:bCs/>
+          <w:color w:val="5D5D5D"/>
+        </w:rPr>
+        <w:t xml:space="preserve"> de </w:t>
+      </w:r>
+      <w:proofErr w:type="spellStart"/>
+      <w:r>
+        <w:rPr>
+          <w:rFonts w:ascii="Segoe UI" w:hAnsi="Segoe UI" w:cs="Segoe UI"/>
+          <w:b/>
+          <w:bCs/>
+          <w:color w:val="5D5D5D"/>
+        </w:rPr>
+        <w:t>voluntariat</w:t>
+      </w:r>
+      <w:proofErr w:type="spellEnd"/>
+      <w:r>
+        <w:rPr>
+          <w:rFonts w:ascii="Segoe UI" w:hAnsi="Segoe UI" w:cs="Segoe UI"/>
+          <w:b/>
+          <w:bCs/>
+          <w:color w:val="5D5D5D"/>
+        </w:rPr>
+        <w:t>.</w:t>
+      </w:r>
+    </w:p>
+    <w:p>
+      <w:pPr>
+        <w:pStyle w:val="ListParagraph"/>
+        <w:jc w:val="center"/>
+        <w:rPr>
+          <w:b/>
+          <w:bCs/>
+          <w:color w:val="EE0000"/>
+          <w:u w:val="single"/>
+        </w:rPr>
+      </w:pPr>
+      <w:r>
+        <w:rPr>
+          <w:b/>
+          <w:bCs/>
+          <w:color w:val="EE0000"/>
+          <w:u w:val="single"/>
+        </w:rPr>
+        <w:drawing>
+          <wp:inline distT="0" distB="0" distL="0" distR="0" wp14:anchorId="69773A8D" wp14:editId="5A8ADF3F">
+            <wp:extent cx="4586371" cy="2487713"/>
+            <wp:effectExtent l="0" t="0" r="5080" b="8255"/>
+            <wp:docPr id="991254185" name="Picture 1"/>
+            <wp:cNvGraphicFramePr>
+              <a:graphicFrameLocks xmlns:a="http://schemas.openxmlformats.org/drawingml/2006/main" noChangeAspect="1"/>
+            </wp:cNvGraphicFramePr>
+            <a:graphic xmlns:a="http://schemas.openxmlformats.org/drawingml/2006/main">
+              <a:graphicData uri="http://schemas.openxmlformats.org/drawingml/2006/picture">
+                <pic:pic xmlns:pic="http://schemas.openxmlformats.org/drawingml/2006/picture">
+                  <pic:nvPicPr>
+                    <pic:cNvPr id="991254185" name=""/>
+                    <pic:cNvPicPr/>
+                  </pic:nvPicPr>
+                  <pic:blipFill>
+                    <a:blip r:embed="rId6"/>
+                    <a:stretch>
+                      <a:fillRect/>
+                    </a:stretch>
+                  </pic:blipFill>
+                  <pic:spPr>
+                    <a:xfrm>
+                      <a:off x="0" y="0"/>
+                      <a:ext cx="4609745" cy="2500391"/>
+                    </a:xfrm>
+                    <a:prstGeom prst="rect">
+                      <a:avLst/>
+                    </a:prstGeom>
+                  </pic:spPr>
+                </pic:pic>
+              </a:graphicData>
+            </a:graphic>
+          </wp:inline>
+        </w:drawing>
+      </w:r>
+    </w:p>
+    <w:p>
+      <w:pPr>
+        <w:rPr>
+          <w:b/>
+          <w:bCs/>
+          <w:color w:val="EE0000"/>
+          <w:u w:val="single"/>
+        </w:rPr>
+      </w:pPr>
+    </w:p>
+    <w:p>
+      <w:pPr>
+        <w:pStyle w:val="ListParagraph"/>
+        <w:numPr>
+          <w:ilvl w:val="0"/>
+          <w:numId w:val="15"/>
+        </w:numPr>
+        <w:rPr>
+          <w:b/>
+          <w:bCs/>
+          <w:color w:val="EE0000"/>
+          <w:highlight w:val="yellow"/>
+          <w:u w:val="single"/>
+        </w:rPr>
+      </w:pPr>
+      <w:r>
+        <w:rPr>
+          <w:b/>
+          <w:bCs/>
+          <w:color w:val="EE0000"/>
+          <w:u w:val="single"/>
+        </w:rPr>
+        <w:t xml:space="preserve">De </w:t>
+      </w:r>
+      <w:proofErr w:type="spellStart"/>
+      <w:r>
+        <w:rPr>
+          <w:b/>
+          <w:bCs/>
+          <w:color w:val="EE0000"/>
+          <w:u w:val="single"/>
+        </w:rPr>
+        <w:t>verificat</w:t>
+      </w:r>
+      <w:proofErr w:type="spellEnd"/>
+      <w:r>
+        <w:rPr>
+          <w:b/>
+          <w:bCs/>
+          <w:color w:val="EE0000"/>
+          <w:u w:val="single"/>
+        </w:rPr>
+        <w:t xml:space="preserve"> de </w:t>
+      </w:r>
+      <w:proofErr w:type="spellStart"/>
+      <w:r>
+        <w:rPr>
+          <w:b/>
+          <w:bCs/>
+          <w:color w:val="EE0000"/>
+          <w:u w:val="single"/>
+        </w:rPr>
+        <w:t>ce</w:t>
+      </w:r>
+      <w:proofErr w:type="spellEnd"/>
+      <w:r>
+        <w:rPr>
+          <w:b/>
+          <w:bCs/>
+          <w:color w:val="EE0000"/>
+          <w:u w:val="single"/>
+        </w:rPr>
+        <w:t xml:space="preserve"> </w:t>
+      </w:r>
+      <w:proofErr w:type="spellStart"/>
+      <w:r>
+        <w:rPr>
+          <w:b/>
+          <w:bCs/>
+          <w:color w:val="EE0000"/>
+          <w:u w:val="single"/>
+        </w:rPr>
+        <w:t>afiseaza</w:t>
+      </w:r>
+      <w:proofErr w:type="spellEnd"/>
+      <w:r>
+        <w:rPr>
+          <w:b/>
+          <w:bCs/>
+          <w:color w:val="EE0000"/>
+          <w:u w:val="single"/>
+        </w:rPr>
+        <w:t xml:space="preserve"> la </w:t>
+      </w:r>
+      <w:proofErr w:type="spellStart"/>
+      <w:r>
+        <w:rPr>
+          <w:b/>
+          <w:bCs/>
+          <w:color w:val="EE0000"/>
+          <w:u w:val="single"/>
+        </w:rPr>
+        <w:t>politica</w:t>
+      </w:r>
+      <w:proofErr w:type="spellEnd"/>
+      <w:r>
+        <w:rPr>
+          <w:b/>
+          <w:bCs/>
+          <w:color w:val="EE0000"/>
+          <w:u w:val="single"/>
+        </w:rPr>
+        <w:t xml:space="preserve"> de </w:t>
+      </w:r>
+      <w:proofErr w:type="spellStart"/>
+      <w:r>
+        <w:rPr>
+          <w:b/>
+          <w:bCs/>
+          <w:color w:val="EE0000"/>
+          <w:u w:val="single"/>
+        </w:rPr>
+        <w:t>configentialitate</w:t>
+      </w:r>
+      <w:proofErr w:type="spellEnd"/>
+      <w:r>
+        <w:rPr>
+          <w:b/>
+          <w:bCs/>
+          <w:color w:val="EE0000"/>
+          <w:u w:val="single"/>
+        </w:rPr>
+        <w:t xml:space="preserve"> </w:t>
+      </w:r>
+      <w:proofErr w:type="spellStart"/>
+      <w:r>
+        <w:rPr>
+          <w:b/>
+          <w:bCs/>
+          <w:color w:val="EE0000"/>
+          <w:u w:val="single"/>
+        </w:rPr>
+        <w:t>doar</w:t>
+      </w:r>
+      <w:proofErr w:type="spellEnd"/>
+      <w:r>
+        <w:rPr>
+          <w:b/>
+          <w:bCs/>
+          <w:color w:val="EE0000"/>
+          <w:u w:val="single"/>
+        </w:rPr>
+        <w:t xml:space="preserve"> </w:t>
+      </w:r>
+      <w:proofErr w:type="spellStart"/>
+      <w:r>
+        <w:rPr>
+          <w:b/>
+          <w:bCs/>
+          <w:color w:val="EE0000"/>
+          <w:u w:val="single"/>
+        </w:rPr>
+        <w:t>pana</w:t>
+      </w:r>
+      <w:proofErr w:type="spellEnd"/>
+      <w:r>
+        <w:rPr>
+          <w:b/>
+          <w:bCs/>
+          <w:color w:val="EE0000"/>
+          <w:u w:val="single"/>
+        </w:rPr>
+        <w:t xml:space="preserve"> la pct 3</w:t>
+      </w:r>
+      <w:r>
+        <w:rPr>
+          <w:b/>
+          <w:bCs/>
+          <w:color w:val="EE0000"/>
+          <w:u w:val="single"/>
+        </w:rPr>
+        <w:t xml:space="preserve"> ==== </w:t>
+      </w:r>
+      <w:r>
+        <w:rPr>
+          <w:b/>
+          <w:bCs/>
+          <w:color w:val="EE0000"/>
+          <w:highlight w:val="yellow"/>
+          <w:u w:val="single"/>
+        </w:rPr>
+        <w:t xml:space="preserve">am </w:t>
+      </w:r>
+      <w:proofErr w:type="spellStart"/>
+      <w:r>
+        <w:rPr>
+          <w:b/>
+          <w:bCs/>
+          <w:color w:val="EE0000"/>
+          <w:highlight w:val="yellow"/>
+          <w:u w:val="single"/>
+        </w:rPr>
+        <w:t>gasit</w:t>
+      </w:r>
+      <w:proofErr w:type="spellEnd"/>
+      <w:r>
+        <w:rPr>
+          <w:b/>
+          <w:bCs/>
+          <w:color w:val="EE0000"/>
+          <w:highlight w:val="yellow"/>
+          <w:u w:val="single"/>
+        </w:rPr>
+        <w:t xml:space="preserve">, cred ca din </w:t>
+      </w:r>
+      <w:proofErr w:type="spellStart"/>
+      <w:r>
+        <w:rPr>
+          <w:b/>
+          <w:bCs/>
+          <w:color w:val="EE0000"/>
+          <w:highlight w:val="yellow"/>
+          <w:u w:val="single"/>
+        </w:rPr>
+        <w:t>greseala</w:t>
+      </w:r>
+      <w:proofErr w:type="spellEnd"/>
+      <w:r>
+        <w:rPr>
+          <w:b/>
+          <w:bCs/>
+          <w:color w:val="EE0000"/>
+          <w:highlight w:val="yellow"/>
+          <w:u w:val="single"/>
+        </w:rPr>
+        <w:t xml:space="preserve"> </w:t>
+      </w:r>
+      <w:proofErr w:type="spellStart"/>
+      <w:r>
+        <w:rPr>
+          <w:b/>
+          <w:bCs/>
+          <w:color w:val="EE0000"/>
+          <w:highlight w:val="yellow"/>
+          <w:u w:val="single"/>
+        </w:rPr>
+        <w:t>cineva</w:t>
+      </w:r>
+      <w:proofErr w:type="spellEnd"/>
+      <w:r>
+        <w:rPr>
+          <w:b/>
+          <w:bCs/>
+          <w:color w:val="EE0000"/>
+          <w:highlight w:val="yellow"/>
+          <w:u w:val="single"/>
+        </w:rPr>
+        <w:t xml:space="preserve"> a </w:t>
+      </w:r>
+      <w:proofErr w:type="spellStart"/>
+      <w:r>
+        <w:rPr>
+          <w:b/>
+          <w:bCs/>
+          <w:color w:val="EE0000"/>
+          <w:highlight w:val="yellow"/>
+          <w:u w:val="single"/>
+        </w:rPr>
+        <w:t>sters</w:t>
+      </w:r>
+      <w:proofErr w:type="spellEnd"/>
+      <w:r>
+        <w:rPr>
+          <w:b/>
+          <w:bCs/>
+          <w:color w:val="EE0000"/>
+          <w:highlight w:val="yellow"/>
+          <w:u w:val="single"/>
+        </w:rPr>
+        <w:t xml:space="preserve"> </w:t>
+      </w:r>
+      <w:proofErr w:type="spellStart"/>
+      <w:r>
+        <w:rPr>
+          <w:b/>
+          <w:bCs/>
+          <w:color w:val="EE0000"/>
+          <w:highlight w:val="yellow"/>
+          <w:u w:val="single"/>
+        </w:rPr>
+        <w:t>textul</w:t>
+      </w:r>
+      <w:proofErr w:type="spellEnd"/>
+      <w:r>
+        <w:rPr>
+          <w:b/>
+          <w:bCs/>
+          <w:color w:val="EE0000"/>
+          <w:highlight w:val="yellow"/>
+          <w:u w:val="single"/>
+        </w:rPr>
+        <w:t xml:space="preserve"> precedent</w:t>
+      </w:r>
+    </w:p>
+    <w:p>
+      <w:pPr>
+        <w:pStyle w:val="ListParagraph"/>
+        <w:rPr>
+          <w:b/>
+          <w:bCs/>
+          <w:color w:val="EE0000"/>
+          <w:u w:val="single"/>
+        </w:rPr>
+      </w:pPr>
+    </w:p>
+    <w:p>
+      <w:pPr>
+        <w:pStyle w:val="ListParagraph"/>
+        <w:numPr>
+          <w:ilvl w:val="0"/>
+          <w:numId w:val="15"/>
+        </w:numPr>
+        <w:rPr>
+          <w:b/>
+          <w:bCs/>
+          <w:color w:val="EE0000"/>
+          <w:u w:val="single"/>
+        </w:rPr>
+      </w:pPr>
+      <w:r>
+        <w:rPr>
+          <w:b/>
+          <w:bCs/>
+          <w:color w:val="EE0000"/>
+          <w:u w:val="single"/>
+        </w:rPr>
+        <w:t xml:space="preserve">Daca </w:t>
+      </w:r>
+      <w:proofErr w:type="spellStart"/>
+      <w:r>
+        <w:rPr>
+          <w:b/>
+          <w:bCs/>
+          <w:color w:val="EE0000"/>
+          <w:u w:val="single"/>
+        </w:rPr>
+        <w:t>programezi</w:t>
+      </w:r>
+      <w:proofErr w:type="spellEnd"/>
+      <w:r>
+        <w:rPr>
+          <w:b/>
+          <w:bCs/>
+          <w:color w:val="EE0000"/>
+          <w:u w:val="single"/>
+        </w:rPr>
+        <w:t xml:space="preserve"> </w:t>
+      </w:r>
+      <w:proofErr w:type="spellStart"/>
+      <w:r>
+        <w:rPr>
+          <w:b/>
+          <w:bCs/>
+          <w:color w:val="EE0000"/>
+          <w:u w:val="single"/>
+        </w:rPr>
+        <w:t>pentru</w:t>
+      </w:r>
+      <w:proofErr w:type="spellEnd"/>
+      <w:r>
+        <w:rPr>
+          <w:b/>
+          <w:bCs/>
+          <w:color w:val="EE0000"/>
+          <w:u w:val="single"/>
+        </w:rPr>
+        <w:t xml:space="preserve"> </w:t>
+      </w:r>
+      <w:proofErr w:type="spellStart"/>
+      <w:r>
+        <w:rPr>
+          <w:b/>
+          <w:bCs/>
+          <w:color w:val="EE0000"/>
+          <w:u w:val="single"/>
+        </w:rPr>
+        <w:t>altcineva</w:t>
+      </w:r>
+      <w:proofErr w:type="spellEnd"/>
+      <w:r>
+        <w:rPr>
+          <w:b/>
+          <w:bCs/>
+          <w:color w:val="EE0000"/>
+          <w:u w:val="single"/>
+        </w:rPr>
+        <w:t xml:space="preserve"> – </w:t>
+      </w:r>
+      <w:proofErr w:type="spellStart"/>
+      <w:r>
+        <w:rPr>
+          <w:b/>
+          <w:bCs/>
+          <w:color w:val="EE0000"/>
+          <w:u w:val="single"/>
+        </w:rPr>
+        <w:t>adresa</w:t>
+      </w:r>
+      <w:proofErr w:type="spellEnd"/>
+      <w:r>
+        <w:rPr>
+          <w:b/>
+          <w:bCs/>
+          <w:color w:val="EE0000"/>
+          <w:u w:val="single"/>
+        </w:rPr>
+        <w:t xml:space="preserve"> de mail </w:t>
+      </w:r>
+      <w:proofErr w:type="spellStart"/>
+      <w:r>
+        <w:rPr>
+          <w:b/>
+          <w:bCs/>
+          <w:color w:val="EE0000"/>
+          <w:u w:val="single"/>
+        </w:rPr>
+        <w:t>sa</w:t>
+      </w:r>
+      <w:proofErr w:type="spellEnd"/>
+      <w:r>
+        <w:rPr>
+          <w:b/>
+          <w:bCs/>
+          <w:color w:val="EE0000"/>
+          <w:u w:val="single"/>
+        </w:rPr>
+        <w:t xml:space="preserve"> </w:t>
+      </w:r>
+      <w:proofErr w:type="spellStart"/>
+      <w:r>
+        <w:rPr>
+          <w:b/>
+          <w:bCs/>
+          <w:color w:val="EE0000"/>
+          <w:u w:val="single"/>
+        </w:rPr>
+        <w:t>poata</w:t>
+      </w:r>
+      <w:proofErr w:type="spellEnd"/>
+      <w:r>
+        <w:rPr>
+          <w:b/>
+          <w:bCs/>
+          <w:color w:val="EE0000"/>
+          <w:u w:val="single"/>
+        </w:rPr>
+        <w:t xml:space="preserve"> fi a </w:t>
+      </w:r>
+      <w:proofErr w:type="spellStart"/>
+      <w:r>
+        <w:rPr>
+          <w:b/>
+          <w:bCs/>
+          <w:color w:val="EE0000"/>
+          <w:u w:val="single"/>
+        </w:rPr>
+        <w:t>contului</w:t>
+      </w:r>
+      <w:proofErr w:type="spellEnd"/>
+      <w:r>
+        <w:rPr>
+          <w:b/>
+          <w:bCs/>
+          <w:color w:val="EE0000"/>
+          <w:u w:val="single"/>
+        </w:rPr>
+        <w:t xml:space="preserve"> care face </w:t>
+      </w:r>
+      <w:proofErr w:type="spellStart"/>
+      <w:r>
+        <w:rPr>
+          <w:b/>
+          <w:bCs/>
+          <w:color w:val="EE0000"/>
+          <w:u w:val="single"/>
+        </w:rPr>
+        <w:t>programarea</w:t>
+      </w:r>
+      <w:proofErr w:type="spellEnd"/>
+      <w:r>
+        <w:rPr>
+          <w:b/>
+          <w:bCs/>
+          <w:color w:val="EE0000"/>
+          <w:u w:val="single"/>
+        </w:rPr>
+        <w:t xml:space="preserve"> SI SA FIE OPTIONALA (pt ca de ex </w:t>
+      </w:r>
+      <w:proofErr w:type="spellStart"/>
+      <w:r>
+        <w:rPr>
+          <w:b/>
+          <w:bCs/>
+          <w:color w:val="EE0000"/>
+          <w:u w:val="single"/>
+        </w:rPr>
+        <w:t>colega</w:t>
+      </w:r>
+      <w:proofErr w:type="spellEnd"/>
+      <w:r>
+        <w:rPr>
+          <w:b/>
+          <w:bCs/>
+          <w:color w:val="EE0000"/>
+          <w:u w:val="single"/>
+        </w:rPr>
+        <w:t xml:space="preserve"> de la service </w:t>
+      </w:r>
+      <w:proofErr w:type="spellStart"/>
+      <w:r>
+        <w:rPr>
+          <w:b/>
+          <w:bCs/>
+          <w:color w:val="EE0000"/>
+          <w:u w:val="single"/>
+        </w:rPr>
+        <w:t>poate</w:t>
+      </w:r>
+      <w:proofErr w:type="spellEnd"/>
+      <w:r>
+        <w:rPr>
+          <w:b/>
+          <w:bCs/>
+          <w:color w:val="EE0000"/>
+          <w:u w:val="single"/>
+        </w:rPr>
+        <w:t xml:space="preserve"> nu stie 7 </w:t>
+      </w:r>
+      <w:proofErr w:type="spellStart"/>
+      <w:r>
+        <w:rPr>
+          <w:b/>
+          <w:bCs/>
+          <w:color w:val="EE0000"/>
+          <w:u w:val="single"/>
+        </w:rPr>
+        <w:t>mailuri</w:t>
+      </w:r>
+      <w:proofErr w:type="spellEnd"/>
+      <w:r>
+        <w:rPr>
+          <w:b/>
+          <w:bCs/>
+          <w:color w:val="EE0000"/>
+          <w:u w:val="single"/>
+        </w:rPr>
+        <w:t xml:space="preserve"> ale </w:t>
+      </w:r>
+      <w:proofErr w:type="spellStart"/>
+      <w:r>
+        <w:rPr>
+          <w:b/>
+          <w:bCs/>
+          <w:color w:val="EE0000"/>
+          <w:u w:val="single"/>
+        </w:rPr>
+        <w:t>colegilor</w:t>
+      </w:r>
+      <w:proofErr w:type="spellEnd"/>
+      <w:r>
+        <w:rPr>
+          <w:b/>
+          <w:bCs/>
+          <w:color w:val="EE0000"/>
+          <w:u w:val="single"/>
+        </w:rPr>
+        <w:t>)</w:t>
+      </w:r>
+      <w:r>
+        <w:rPr>
+          <w:b/>
+          <w:bCs/>
+          <w:color w:val="EE0000"/>
+          <w:u w:val="single"/>
+        </w:rPr>
+        <w:t xml:space="preserve"> – </w:t>
+      </w:r>
+      <w:proofErr w:type="spellStart"/>
+      <w:r>
+        <w:rPr>
+          <w:b/>
+          <w:bCs/>
+          <w:color w:val="EE0000"/>
+          <w:u w:val="single"/>
+        </w:rPr>
+        <w:t>acum</w:t>
+      </w:r>
+      <w:proofErr w:type="spellEnd"/>
+      <w:r>
+        <w:rPr>
+          <w:b/>
+          <w:bCs/>
+          <w:color w:val="EE0000"/>
+          <w:u w:val="single"/>
+        </w:rPr>
+        <w:t xml:space="preserve"> </w:t>
+      </w:r>
+      <w:proofErr w:type="spellStart"/>
+      <w:r>
+        <w:rPr>
+          <w:b/>
+          <w:bCs/>
+          <w:color w:val="EE0000"/>
+          <w:u w:val="single"/>
+        </w:rPr>
+        <w:t>daca</w:t>
+      </w:r>
+      <w:proofErr w:type="spellEnd"/>
+      <w:r>
+        <w:rPr>
+          <w:b/>
+          <w:bCs/>
+          <w:color w:val="EE0000"/>
+          <w:u w:val="single"/>
+        </w:rPr>
+        <w:t xml:space="preserve"> pun </w:t>
+      </w:r>
+      <w:proofErr w:type="spellStart"/>
+      <w:r>
+        <w:rPr>
+          <w:b/>
+          <w:bCs/>
+          <w:color w:val="EE0000"/>
+          <w:u w:val="single"/>
+        </w:rPr>
+        <w:t>telefonul</w:t>
+      </w:r>
+      <w:proofErr w:type="spellEnd"/>
+      <w:r>
+        <w:rPr>
+          <w:b/>
+          <w:bCs/>
+          <w:color w:val="EE0000"/>
+          <w:u w:val="single"/>
+        </w:rPr>
+        <w:t xml:space="preserve"> </w:t>
+      </w:r>
+      <w:proofErr w:type="spellStart"/>
+      <w:r>
+        <w:rPr>
+          <w:b/>
+          <w:bCs/>
+          <w:color w:val="EE0000"/>
+          <w:u w:val="single"/>
+        </w:rPr>
+        <w:t>lui</w:t>
+      </w:r>
+      <w:proofErr w:type="spellEnd"/>
+      <w:r>
+        <w:rPr>
+          <w:b/>
+          <w:bCs/>
+          <w:color w:val="EE0000"/>
+          <w:u w:val="single"/>
+        </w:rPr>
+        <w:t xml:space="preserve"> X </w:t>
+      </w:r>
+      <w:proofErr w:type="spellStart"/>
+      <w:r>
+        <w:rPr>
+          <w:b/>
+          <w:bCs/>
+          <w:color w:val="EE0000"/>
+          <w:u w:val="single"/>
+        </w:rPr>
+        <w:t>dar</w:t>
+      </w:r>
+      <w:proofErr w:type="spellEnd"/>
+      <w:r>
+        <w:rPr>
+          <w:b/>
+          <w:bCs/>
+          <w:color w:val="EE0000"/>
+          <w:u w:val="single"/>
+        </w:rPr>
+        <w:t xml:space="preserve"> </w:t>
+      </w:r>
+      <w:proofErr w:type="spellStart"/>
+      <w:r>
+        <w:rPr>
+          <w:b/>
+          <w:bCs/>
+          <w:color w:val="EE0000"/>
+          <w:u w:val="single"/>
+        </w:rPr>
+        <w:t>mailul</w:t>
+      </w:r>
+      <w:proofErr w:type="spellEnd"/>
+      <w:r>
+        <w:rPr>
+          <w:b/>
+          <w:bCs/>
+          <w:color w:val="EE0000"/>
+          <w:u w:val="single"/>
+        </w:rPr>
+        <w:t xml:space="preserve"> meu, nu ma </w:t>
+      </w:r>
+      <w:proofErr w:type="spellStart"/>
+      <w:r>
+        <w:rPr>
+          <w:b/>
+          <w:bCs/>
+          <w:color w:val="EE0000"/>
+          <w:u w:val="single"/>
+        </w:rPr>
+        <w:t>lasa</w:t>
+      </w:r>
+      <w:proofErr w:type="spellEnd"/>
+      <w:r>
+        <w:rPr>
+          <w:b/>
+          <w:bCs/>
+          <w:color w:val="EE0000"/>
+          <w:u w:val="single"/>
+        </w:rPr>
+        <w:t xml:space="preserve">, </w:t>
+      </w:r>
+      <w:proofErr w:type="spellStart"/>
+      <w:r>
+        <w:rPr>
+          <w:b/>
+          <w:bCs/>
+          <w:color w:val="EE0000"/>
+          <w:u w:val="single"/>
+        </w:rPr>
+        <w:t>imi</w:t>
+      </w:r>
+      <w:proofErr w:type="spellEnd"/>
+      <w:r>
+        <w:rPr>
+          <w:b/>
+          <w:bCs/>
+          <w:color w:val="EE0000"/>
+          <w:u w:val="single"/>
+        </w:rPr>
+        <w:t xml:space="preserve"> da </w:t>
+      </w:r>
+      <w:proofErr w:type="spellStart"/>
+      <w:r>
+        <w:rPr>
+          <w:b/>
+          <w:bCs/>
+          <w:color w:val="EE0000"/>
+          <w:u w:val="single"/>
+        </w:rPr>
+        <w:t>eroarea</w:t>
+      </w:r>
+      <w:proofErr w:type="spellEnd"/>
+      <w:r>
+        <w:rPr>
+          <w:b/>
+          <w:bCs/>
+          <w:color w:val="EE0000"/>
+          <w:u w:val="single"/>
+        </w:rPr>
+        <w:t xml:space="preserve"> </w:t>
+      </w:r>
+      <w:proofErr w:type="spellStart"/>
+      <w:r>
+        <w:rPr>
+          <w:b/>
+          <w:bCs/>
+          <w:color w:val="EE0000"/>
+          <w:u w:val="single"/>
+        </w:rPr>
+        <w:t>asta</w:t>
+      </w:r>
+      <w:proofErr w:type="spellEnd"/>
+    </w:p>
+    <w:p>
+      <w:pPr>
+        <w:pStyle w:val="ListParagraph"/>
+        <w:jc w:val="center"/>
+        <w:rPr>
+          <w:b/>
+          <w:bCs/>
+          <w:color w:val="EE0000"/>
+          <w:u w:val="single"/>
+        </w:rPr>
+      </w:pPr>
+      <w:r>
+        <w:rPr>
+          <w:b/>
+          <w:bCs/>
+          <w:color w:val="EE0000"/>
+          <w:u w:val="single"/>
+        </w:rPr>
+        <w:drawing>
+          <wp:inline distT="0" distB="0" distL="0" distR="0" wp14:anchorId="79EE52E3" wp14:editId="141EA567">
+            <wp:extent cx="3009575" cy="2863919"/>
+            <wp:effectExtent l="0" t="0" r="635" b="0"/>
+            <wp:docPr id="967216861" name="Picture 1"/>
+            <wp:cNvGraphicFramePr>
+              <a:graphicFrameLocks xmlns:a="http://schemas.openxmlformats.org/drawingml/2006/main" noChangeAspect="1"/>
+            </wp:cNvGraphicFramePr>
+            <a:graphic xmlns:a="http://schemas.openxmlformats.org/drawingml/2006/main">
+              <a:graphicData uri="http://schemas.openxmlformats.org/drawingml/2006/picture">
+                <pic:pic xmlns:pic="http://schemas.openxmlformats.org/drawingml/2006/picture">
+                  <pic:nvPicPr>
+                    <pic:cNvPr id="967216861" name=""/>
+                    <pic:cNvPicPr/>
+                  </pic:nvPicPr>
+                  <pic:blipFill>
+                    <a:blip r:embed="rId7"/>
+                    <a:stretch>
+                      <a:fillRect/>
+                    </a:stretch>
+                  </pic:blipFill>
+                  <pic:spPr>
+                    <a:xfrm>
+                      <a:off x="0" y="0"/>
+                      <a:ext cx="3016359" cy="2870374"/>
+                    </a:xfrm>
+                    <a:prstGeom prst="rect">
+                      <a:avLst/>
+                    </a:prstGeom>
+                  </pic:spPr>
+                </pic:pic>
+              </a:graphicData>
+            </a:graphic>
+          </wp:inline>
+        </w:drawing>
+      </w:r>
+    </w:p>
+    <w:p>
+      <w:pPr>
+        <w:pStyle w:val="ListParagraph"/>
+        <w:jc w:val="center"/>
+        <w:rPr>
+          <w:b/>
+          <w:bCs/>
+          <w:color w:val="EE0000"/>
+          <w:u w:val="single"/>
+        </w:rPr>
+      </w:pPr>
+    </w:p>
+    <w:p>
+      <w:pPr>
+        <w:pStyle w:val="ListParagraph"/>
+        <w:numPr>
+          <w:ilvl w:val="0"/>
+          <w:numId w:val="15"/>
+        </w:numPr>
+        <w:rPr>
+          <w:b/>
+          <w:bCs/>
+          <w:color w:val="EE0000"/>
+          <w:u w:val="single"/>
+        </w:rPr>
+      </w:pPr>
+      <w:r>
+        <w:rPr>
+          <w:b/>
+          <w:bCs/>
+          <w:color w:val="EE0000"/>
+          <w:u w:val="single"/>
+        </w:rPr>
+        <w:t xml:space="preserve">Daca mi-am </w:t>
+      </w:r>
+      <w:proofErr w:type="spellStart"/>
+      <w:r>
+        <w:rPr>
+          <w:b/>
+          <w:bCs/>
+          <w:color w:val="EE0000"/>
+          <w:u w:val="single"/>
+        </w:rPr>
+        <w:t>facut</w:t>
+      </w:r>
+      <w:proofErr w:type="spellEnd"/>
+      <w:r>
+        <w:rPr>
+          <w:b/>
+          <w:bCs/>
+          <w:color w:val="EE0000"/>
+          <w:u w:val="single"/>
+        </w:rPr>
+        <w:t xml:space="preserve"> </w:t>
+      </w:r>
+      <w:proofErr w:type="spellStart"/>
+      <w:r>
+        <w:rPr>
+          <w:b/>
+          <w:bCs/>
+          <w:color w:val="EE0000"/>
+          <w:u w:val="single"/>
+        </w:rPr>
+        <w:t>mie</w:t>
+      </w:r>
+      <w:proofErr w:type="spellEnd"/>
+      <w:r>
+        <w:rPr>
+          <w:b/>
+          <w:bCs/>
+          <w:color w:val="EE0000"/>
+          <w:u w:val="single"/>
+        </w:rPr>
+        <w:t xml:space="preserve"> o </w:t>
+      </w:r>
+      <w:proofErr w:type="spellStart"/>
+      <w:r>
+        <w:rPr>
+          <w:b/>
+          <w:bCs/>
+          <w:color w:val="EE0000"/>
+          <w:u w:val="single"/>
+        </w:rPr>
+        <w:t>programare</w:t>
+      </w:r>
+      <w:proofErr w:type="spellEnd"/>
+      <w:r>
+        <w:rPr>
+          <w:b/>
+          <w:bCs/>
+          <w:color w:val="EE0000"/>
+          <w:u w:val="single"/>
+        </w:rPr>
+        <w:t xml:space="preserve"> </w:t>
+      </w:r>
+      <w:proofErr w:type="spellStart"/>
+      <w:r>
+        <w:rPr>
+          <w:b/>
+          <w:bCs/>
+          <w:color w:val="EE0000"/>
+          <w:u w:val="single"/>
+        </w:rPr>
+        <w:t>si</w:t>
+      </w:r>
+      <w:proofErr w:type="spellEnd"/>
+      <w:r>
+        <w:rPr>
+          <w:b/>
+          <w:bCs/>
+          <w:color w:val="EE0000"/>
+          <w:u w:val="single"/>
+        </w:rPr>
+        <w:t xml:space="preserve"> </w:t>
+      </w:r>
+      <w:proofErr w:type="spellStart"/>
+      <w:r>
+        <w:rPr>
+          <w:b/>
+          <w:bCs/>
+          <w:color w:val="EE0000"/>
+          <w:u w:val="single"/>
+        </w:rPr>
+        <w:t>vreau</w:t>
+      </w:r>
+      <w:proofErr w:type="spellEnd"/>
+      <w:r>
+        <w:rPr>
+          <w:b/>
+          <w:bCs/>
+          <w:color w:val="EE0000"/>
+          <w:u w:val="single"/>
+        </w:rPr>
+        <w:t xml:space="preserve"> pe </w:t>
+      </w:r>
+      <w:proofErr w:type="spellStart"/>
+      <w:r>
+        <w:rPr>
+          <w:b/>
+          <w:bCs/>
+          <w:color w:val="EE0000"/>
+          <w:u w:val="single"/>
+        </w:rPr>
+        <w:t>altcineva</w:t>
+      </w:r>
+      <w:proofErr w:type="spellEnd"/>
+      <w:r>
+        <w:rPr>
+          <w:b/>
+          <w:bCs/>
+          <w:color w:val="EE0000"/>
+          <w:u w:val="single"/>
+        </w:rPr>
+        <w:t xml:space="preserve"> in waitlist – nu </w:t>
+      </w:r>
+      <w:proofErr w:type="spellStart"/>
+      <w:r>
+        <w:rPr>
+          <w:b/>
+          <w:bCs/>
+          <w:color w:val="EE0000"/>
+          <w:u w:val="single"/>
+        </w:rPr>
+        <w:t>mai</w:t>
+      </w:r>
+      <w:proofErr w:type="spellEnd"/>
+      <w:r>
+        <w:rPr>
+          <w:b/>
+          <w:bCs/>
+          <w:color w:val="EE0000"/>
+          <w:u w:val="single"/>
+        </w:rPr>
+        <w:t xml:space="preserve"> pot – </w:t>
+      </w:r>
+      <w:proofErr w:type="spellStart"/>
+      <w:r>
+        <w:rPr>
+          <w:b/>
+          <w:bCs/>
+          <w:color w:val="EE0000"/>
+          <w:u w:val="single"/>
+        </w:rPr>
+        <w:t>imi</w:t>
+      </w:r>
+      <w:proofErr w:type="spellEnd"/>
+      <w:r>
+        <w:rPr>
+          <w:b/>
+          <w:bCs/>
+          <w:color w:val="EE0000"/>
+          <w:u w:val="single"/>
+        </w:rPr>
+        <w:t xml:space="preserve"> da </w:t>
+      </w:r>
+      <w:proofErr w:type="spellStart"/>
+      <w:r>
+        <w:rPr>
+          <w:b/>
+          <w:bCs/>
+          <w:color w:val="EE0000"/>
+          <w:u w:val="single"/>
+        </w:rPr>
+        <w:t>eroare</w:t>
+      </w:r>
+      <w:proofErr w:type="spellEnd"/>
+      <w:r>
+        <w:rPr>
+          <w:b/>
+          <w:bCs/>
+          <w:color w:val="EE0000"/>
+          <w:u w:val="single"/>
+        </w:rPr>
+        <w:t xml:space="preserve"> </w:t>
+      </w:r>
+    </w:p>
+    <w:p>
+      <w:pPr>
+        <w:pStyle w:val="ListParagraph"/>
+        <w:jc w:val="center"/>
+        <w:rPr>
+          <w:b/>
+          <w:bCs/>
+          <w:color w:val="EE0000"/>
+          <w:u w:val="single"/>
+        </w:rPr>
+      </w:pPr>
+      <w:r>
+        <w:rPr>
+          <w:b/>
+          <w:bCs/>
+          <w:color w:val="EE0000"/>
+          <w:u w:val="single"/>
+        </w:rPr>
+        <w:drawing>
+          <wp:inline distT="0" distB="0" distL="0" distR="0" wp14:anchorId="64CBDEEC" wp14:editId="441BFA46">
+            <wp:extent cx="3025140" cy="2037535"/>
+            <wp:effectExtent l="0" t="0" r="3810" b="1270"/>
+            <wp:docPr id="315751414" name="Picture 1"/>
+            <wp:cNvGraphicFramePr>
+              <a:graphicFrameLocks xmlns:a="http://schemas.openxmlformats.org/drawingml/2006/main" noChangeAspect="1"/>
+            </wp:cNvGraphicFramePr>
+            <a:graphic xmlns:a="http://schemas.openxmlformats.org/drawingml/2006/main">
+              <a:graphicData uri="http://schemas.openxmlformats.org/drawingml/2006/picture">
+                <pic:pic xmlns:pic="http://schemas.openxmlformats.org/drawingml/2006/picture">
+                  <pic:nvPicPr>
+                    <pic:cNvPr id="315751414" name=""/>
+                    <pic:cNvPicPr/>
+                  </pic:nvPicPr>
+                  <pic:blipFill>
+                    <a:blip r:embed="rId8"/>
+                    <a:stretch>
+                      <a:fillRect/>
+                    </a:stretch>
+                  </pic:blipFill>
+                  <pic:spPr>
+                    <a:xfrm>
+                      <a:off x="0" y="0"/>
+                      <a:ext cx="3030987" cy="2041473"/>
+                    </a:xfrm>
+                    <a:prstGeom prst="rect">
+                      <a:avLst/>
+                    </a:prstGeom>
+                  </pic:spPr>
+                </pic:pic>
+              </a:graphicData>
+            </a:graphic>
+          </wp:inline>
+        </w:drawing>
+      </w:r>
+    </w:p>
+    <w:p>
+      <w:pPr>
+        <w:pStyle w:val="ListParagraph"/>
+        <w:jc w:val="center"/>
+        <w:rPr>
+          <w:b/>
+          <w:bCs/>
+          <w:color w:val="EE0000"/>
+          <w:u w:val="single"/>
+        </w:rPr>
+      </w:pPr>
+    </w:p>
+    <w:p>
+      <w:pPr>
+        <w:pStyle w:val="ListParagraph"/>
+        <w:numPr>
+          <w:ilvl w:val="0"/>
+          <w:numId w:val="15"/>
+        </w:numPr>
+        <w:rPr>
+          <w:b/>
+          <w:bCs/>
+          <w:color w:val="EE0000"/>
+          <w:u w:val="single"/>
+        </w:rPr>
+      </w:pPr>
+      <w:r>
+        <w:rPr>
+          <w:b/>
+          <w:bCs/>
+          <w:color w:val="EE0000"/>
+          <w:u w:val="single"/>
+        </w:rPr>
+        <w:t xml:space="preserve">De pus </w:t>
+      </w:r>
+      <w:proofErr w:type="spellStart"/>
+      <w:r>
+        <w:rPr>
+          <w:b/>
+          <w:bCs/>
+          <w:color w:val="EE0000"/>
+          <w:u w:val="single"/>
+        </w:rPr>
+        <w:t>si</w:t>
+      </w:r>
+      <w:proofErr w:type="spellEnd"/>
+      <w:r>
+        <w:rPr>
+          <w:b/>
+          <w:bCs/>
+          <w:color w:val="EE0000"/>
+          <w:u w:val="single"/>
+        </w:rPr>
+        <w:t xml:space="preserve"> </w:t>
+      </w:r>
+      <w:proofErr w:type="spellStart"/>
+      <w:r>
+        <w:rPr>
+          <w:b/>
+          <w:bCs/>
+          <w:color w:val="EE0000"/>
+          <w:u w:val="single"/>
+        </w:rPr>
+        <w:t>programarile</w:t>
+      </w:r>
+      <w:proofErr w:type="spellEnd"/>
+      <w:r>
+        <w:rPr>
+          <w:b/>
+          <w:bCs/>
+          <w:color w:val="EE0000"/>
+          <w:u w:val="single"/>
+        </w:rPr>
+        <w:t xml:space="preserve"> din waitlist</w:t>
+      </w:r>
+    </w:p>
+    <w:p>
+      <w:pPr>
+        <w:ind w:left="1440"/>
+        <w:rPr>
+          <w:b/>
+          <w:bCs/>
+          <w:color w:val="EE0000"/>
+          <w:u w:val="single"/>
+        </w:rPr>
+      </w:pPr>
+      <w:r>
+        <w:rPr>
+          <w:b/>
+          <w:bCs/>
+          <w:color w:val="EE0000"/>
+          <w:u w:val="single"/>
+        </w:rPr>
+        <w:drawing>
+          <wp:inline distT="0" distB="0" distL="0" distR="0" wp14:anchorId="03936E28" wp14:editId="3C55024A">
+            <wp:extent cx="3505200" cy="1245544"/>
+            <wp:effectExtent l="0" t="0" r="0" b="0"/>
+            <wp:docPr id="1451331983" name="Picture 1"/>
+            <wp:cNvGraphicFramePr>
+              <a:graphicFrameLocks xmlns:a="http://schemas.openxmlformats.org/drawingml/2006/main" noChangeAspect="1"/>
+            </wp:cNvGraphicFramePr>
+            <a:graphic xmlns:a="http://schemas.openxmlformats.org/drawingml/2006/main">
+              <a:graphicData uri="http://schemas.openxmlformats.org/drawingml/2006/picture">
+                <pic:pic xmlns:pic="http://schemas.openxmlformats.org/drawingml/2006/picture">
+                  <pic:nvPicPr>
+                    <pic:cNvPr id="1451331983" name=""/>
+                    <pic:cNvPicPr/>
+                  </pic:nvPicPr>
+                  <pic:blipFill>
+                    <a:blip r:embed="rId9"/>
+                    <a:stretch>
+                      <a:fillRect/>
+                    </a:stretch>
+                  </pic:blipFill>
+                  <pic:spPr>
+                    <a:xfrm>
+                      <a:off x="0" y="0"/>
+                      <a:ext cx="3547865" cy="1260705"/>
+                    </a:xfrm>
+                    <a:prstGeom prst="rect">
+                      <a:avLst/>
+                    </a:prstGeom>
+                  </pic:spPr>
+                </pic:pic>
+              </a:graphicData>
+            </a:graphic>
+          </wp:inline>
+        </w:drawing>
+      </w:r>
+    </w:p>
+    <w:p>
+      <w:pPr>
+        <w:pStyle w:val="ListParagraph"/>
+        <w:numPr>
+          <w:ilvl w:val="0"/>
+          <w:numId w:val="15"/>
+        </w:numPr>
+        <w:rPr>
+          <w:b/>
+          <w:bCs/>
+          <w:color w:val="EE0000"/>
+          <w:u w:val="single"/>
+        </w:rPr>
+      </w:pPr>
+      <w:proofErr w:type="spellStart"/>
+      <w:r>
+        <w:rPr>
+          <w:b/>
+          <w:bCs/>
+          <w:color w:val="EE0000"/>
+          <w:u w:val="single"/>
+        </w:rPr>
+        <w:lastRenderedPageBreak/>
+        <w:t>Isoric</w:t>
+      </w:r>
+      <w:proofErr w:type="spellEnd"/>
+      <w:r>
+        <w:rPr>
+          <w:b/>
+          <w:bCs/>
+          <w:color w:val="EE0000"/>
+          <w:u w:val="single"/>
+        </w:rPr>
+        <w:t xml:space="preserve"> </w:t>
+      </w:r>
+      <w:proofErr w:type="spellStart"/>
+      <w:r>
+        <w:rPr>
+          <w:b/>
+          <w:bCs/>
+          <w:color w:val="EE0000"/>
+          <w:u w:val="single"/>
+        </w:rPr>
+        <w:t>participari</w:t>
+      </w:r>
+      <w:proofErr w:type="spellEnd"/>
+      <w:r>
+        <w:rPr>
+          <w:b/>
+          <w:bCs/>
+          <w:color w:val="EE0000"/>
+          <w:u w:val="single"/>
+        </w:rPr>
+        <w:t xml:space="preserve"> </w:t>
+      </w:r>
+      <w:proofErr w:type="spellStart"/>
+      <w:r>
+        <w:rPr>
+          <w:b/>
+          <w:bCs/>
+          <w:color w:val="EE0000"/>
+          <w:u w:val="single"/>
+        </w:rPr>
+        <w:t>donare</w:t>
+      </w:r>
+      <w:proofErr w:type="spellEnd"/>
+      <w:r>
+        <w:rPr>
+          <w:b/>
+          <w:bCs/>
+          <w:color w:val="EE0000"/>
+          <w:u w:val="single"/>
+        </w:rPr>
+        <w:t xml:space="preserve"> - </w:t>
+      </w:r>
+      <w:proofErr w:type="spellStart"/>
+      <w:r>
+        <w:rPr>
+          <w:b/>
+          <w:bCs/>
+          <w:color w:val="EE0000"/>
+          <w:u w:val="single"/>
+        </w:rPr>
+        <w:t>a</w:t>
+      </w:r>
+      <w:r>
+        <w:rPr>
+          <w:b/>
+          <w:bCs/>
+          <w:color w:val="EE0000"/>
+          <w:u w:val="single"/>
+        </w:rPr>
+        <w:t>r</w:t>
+      </w:r>
+      <w:proofErr w:type="spellEnd"/>
+      <w:r>
+        <w:rPr>
+          <w:b/>
+          <w:bCs/>
+          <w:color w:val="EE0000"/>
+          <w:u w:val="single"/>
+        </w:rPr>
+        <w:t xml:space="preserve"> </w:t>
+      </w:r>
+      <w:proofErr w:type="spellStart"/>
+      <w:r>
+        <w:rPr>
+          <w:b/>
+          <w:bCs/>
+          <w:color w:val="EE0000"/>
+          <w:u w:val="single"/>
+        </w:rPr>
+        <w:t>trebui</w:t>
+      </w:r>
+      <w:proofErr w:type="spellEnd"/>
+      <w:r>
+        <w:rPr>
+          <w:b/>
+          <w:bCs/>
+          <w:color w:val="EE0000"/>
+          <w:u w:val="single"/>
+        </w:rPr>
+        <w:t xml:space="preserve"> separate </w:t>
+      </w:r>
+    </w:p>
+    <w:p>
+      <w:pPr>
+        <w:pStyle w:val="ListParagraph"/>
+        <w:numPr>
+          <w:ilvl w:val="1"/>
+          <w:numId w:val="15"/>
+        </w:numPr>
+        <w:rPr>
+          <w:b/>
+          <w:bCs/>
+          <w:color w:val="EE0000"/>
+          <w:u w:val="single"/>
+        </w:rPr>
+      </w:pPr>
+      <w:proofErr w:type="spellStart"/>
+      <w:r>
+        <w:rPr>
+          <w:b/>
+          <w:bCs/>
+          <w:color w:val="EE0000"/>
+          <w:u w:val="single"/>
+        </w:rPr>
+        <w:t>cele</w:t>
+      </w:r>
+      <w:proofErr w:type="spellEnd"/>
+      <w:r>
+        <w:rPr>
+          <w:b/>
+          <w:bCs/>
+          <w:color w:val="EE0000"/>
+          <w:u w:val="single"/>
+        </w:rPr>
+        <w:t xml:space="preserve"> care sunt </w:t>
+      </w:r>
+      <w:proofErr w:type="spellStart"/>
+      <w:r>
+        <w:rPr>
+          <w:b/>
+          <w:bCs/>
+          <w:color w:val="EE0000"/>
+          <w:u w:val="single"/>
+        </w:rPr>
+        <w:t>facute</w:t>
+      </w:r>
+      <w:proofErr w:type="spellEnd"/>
+      <w:r>
+        <w:rPr>
+          <w:b/>
+          <w:bCs/>
+          <w:color w:val="EE0000"/>
+          <w:u w:val="single"/>
+        </w:rPr>
+        <w:t xml:space="preserve"> </w:t>
+      </w:r>
+      <w:proofErr w:type="spellStart"/>
+      <w:r>
+        <w:rPr>
+          <w:b/>
+          <w:bCs/>
+          <w:color w:val="EE0000"/>
+          <w:u w:val="single"/>
+        </w:rPr>
+        <w:t>pentru</w:t>
+      </w:r>
+      <w:proofErr w:type="spellEnd"/>
+      <w:r>
+        <w:rPr>
+          <w:b/>
+          <w:bCs/>
+          <w:color w:val="EE0000"/>
+          <w:u w:val="single"/>
+        </w:rPr>
+        <w:t xml:space="preserve"> mine</w:t>
+      </w:r>
+      <w:r>
+        <w:rPr>
+          <w:b/>
+          <w:bCs/>
+          <w:color w:val="EE0000"/>
+          <w:u w:val="single"/>
+        </w:rPr>
+        <w:t xml:space="preserve"> </w:t>
+      </w:r>
+      <w:r>
+        <w:rPr>
+          <w:b/>
+          <w:bCs/>
+          <w:color w:val="EE0000"/>
+          <w:u w:val="single"/>
+        </w:rPr>
+        <w:t xml:space="preserve">(la </w:t>
+      </w:r>
+      <w:proofErr w:type="spellStart"/>
+      <w:r>
+        <w:rPr>
+          <w:b/>
+          <w:bCs/>
+          <w:color w:val="EE0000"/>
+          <w:u w:val="single"/>
+        </w:rPr>
+        <w:t>istoric</w:t>
+      </w:r>
+      <w:proofErr w:type="spellEnd"/>
+      <w:r>
+        <w:rPr>
+          <w:b/>
+          <w:bCs/>
+          <w:color w:val="EE0000"/>
+          <w:u w:val="single"/>
+        </w:rPr>
+        <w:t xml:space="preserve"> </w:t>
+      </w:r>
+      <w:proofErr w:type="spellStart"/>
+      <w:r>
+        <w:rPr>
+          <w:b/>
+          <w:bCs/>
+          <w:color w:val="EE0000"/>
+          <w:u w:val="single"/>
+        </w:rPr>
+        <w:t>participari</w:t>
+      </w:r>
+      <w:proofErr w:type="spellEnd"/>
+      <w:r>
+        <w:rPr>
+          <w:b/>
+          <w:bCs/>
+          <w:color w:val="EE0000"/>
+          <w:u w:val="single"/>
+        </w:rPr>
+        <w:t xml:space="preserve"> </w:t>
+      </w:r>
+      <w:proofErr w:type="spellStart"/>
+      <w:r>
+        <w:rPr>
+          <w:b/>
+          <w:bCs/>
+          <w:color w:val="EE0000"/>
+          <w:u w:val="single"/>
+        </w:rPr>
+        <w:t>donare</w:t>
+      </w:r>
+      <w:proofErr w:type="spellEnd"/>
+      <w:r>
+        <w:rPr>
+          <w:b/>
+          <w:bCs/>
+          <w:color w:val="EE0000"/>
+          <w:u w:val="single"/>
+        </w:rPr>
+        <w:t xml:space="preserve">) – total </w:t>
+      </w:r>
+      <w:proofErr w:type="spellStart"/>
+      <w:r>
+        <w:rPr>
+          <w:b/>
+          <w:bCs/>
+          <w:color w:val="EE0000"/>
+          <w:u w:val="single"/>
+        </w:rPr>
+        <w:t>donari</w:t>
+      </w:r>
+      <w:proofErr w:type="spellEnd"/>
+      <w:r>
+        <w:rPr>
+          <w:b/>
+          <w:bCs/>
+          <w:color w:val="EE0000"/>
+          <w:u w:val="single"/>
+        </w:rPr>
+        <w:t xml:space="preserve"> </w:t>
+      </w:r>
+      <w:proofErr w:type="spellStart"/>
+      <w:r>
+        <w:rPr>
+          <w:b/>
+          <w:bCs/>
+          <w:color w:val="EE0000"/>
+          <w:u w:val="single"/>
+        </w:rPr>
+        <w:t>sa</w:t>
+      </w:r>
+      <w:proofErr w:type="spellEnd"/>
+      <w:r>
+        <w:rPr>
+          <w:b/>
+          <w:bCs/>
+          <w:color w:val="EE0000"/>
+          <w:u w:val="single"/>
+        </w:rPr>
+        <w:t xml:space="preserve"> fie ale mele (</w:t>
+      </w:r>
+      <w:proofErr w:type="spellStart"/>
+      <w:r>
+        <w:rPr>
+          <w:b/>
+          <w:bCs/>
+          <w:color w:val="EE0000"/>
+          <w:u w:val="single"/>
+        </w:rPr>
+        <w:t>sa</w:t>
+      </w:r>
+      <w:proofErr w:type="spellEnd"/>
+      <w:r>
+        <w:rPr>
+          <w:b/>
+          <w:bCs/>
+          <w:color w:val="EE0000"/>
+          <w:u w:val="single"/>
+        </w:rPr>
+        <w:t xml:space="preserve"> nu </w:t>
+      </w:r>
+      <w:proofErr w:type="spellStart"/>
+      <w:r>
+        <w:rPr>
+          <w:b/>
+          <w:bCs/>
+          <w:color w:val="EE0000"/>
+          <w:u w:val="single"/>
+        </w:rPr>
+        <w:t>adune</w:t>
+      </w:r>
+      <w:proofErr w:type="spellEnd"/>
+      <w:r>
+        <w:rPr>
+          <w:b/>
+          <w:bCs/>
+          <w:color w:val="EE0000"/>
+          <w:u w:val="single"/>
+        </w:rPr>
+        <w:t xml:space="preserve"> </w:t>
+      </w:r>
+      <w:proofErr w:type="spellStart"/>
+      <w:r>
+        <w:rPr>
+          <w:b/>
+          <w:bCs/>
+          <w:color w:val="EE0000"/>
+          <w:u w:val="single"/>
+        </w:rPr>
+        <w:t>si</w:t>
+      </w:r>
+      <w:proofErr w:type="spellEnd"/>
+      <w:r>
+        <w:rPr>
+          <w:b/>
+          <w:bCs/>
+          <w:color w:val="EE0000"/>
+          <w:u w:val="single"/>
+        </w:rPr>
+        <w:t xml:space="preserve"> pe a </w:t>
+      </w:r>
+      <w:proofErr w:type="spellStart"/>
+      <w:r>
+        <w:rPr>
+          <w:b/>
+          <w:bCs/>
+          <w:color w:val="EE0000"/>
+          <w:u w:val="single"/>
+        </w:rPr>
+        <w:t>celorlalti</w:t>
+      </w:r>
+      <w:proofErr w:type="spellEnd"/>
+      <w:r>
+        <w:rPr>
+          <w:b/>
+          <w:bCs/>
+          <w:color w:val="EE0000"/>
+          <w:u w:val="single"/>
+        </w:rPr>
+        <w:t xml:space="preserve"> </w:t>
+      </w:r>
+      <w:proofErr w:type="spellStart"/>
+      <w:r>
+        <w:rPr>
+          <w:b/>
+          <w:bCs/>
+          <w:color w:val="EE0000"/>
+          <w:u w:val="single"/>
+        </w:rPr>
+        <w:t>programati</w:t>
+      </w:r>
+      <w:proofErr w:type="spellEnd"/>
+    </w:p>
+    <w:p>
+      <w:pPr>
+        <w:pStyle w:val="ListParagraph"/>
+        <w:numPr>
+          <w:ilvl w:val="1"/>
+          <w:numId w:val="15"/>
+        </w:numPr>
+        <w:rPr>
+          <w:b/>
+          <w:bCs/>
+          <w:color w:val="EE0000"/>
+          <w:u w:val="single"/>
+        </w:rPr>
+      </w:pPr>
+      <w:proofErr w:type="spellStart"/>
+      <w:r>
+        <w:rPr>
+          <w:b/>
+          <w:bCs/>
+          <w:color w:val="EE0000"/>
+          <w:u w:val="single"/>
+        </w:rPr>
+        <w:t>si</w:t>
+      </w:r>
+      <w:proofErr w:type="spellEnd"/>
+      <w:r>
+        <w:rPr>
+          <w:b/>
+          <w:bCs/>
+          <w:color w:val="EE0000"/>
+          <w:u w:val="single"/>
+        </w:rPr>
+        <w:t xml:space="preserve"> </w:t>
+      </w:r>
+      <w:proofErr w:type="spellStart"/>
+      <w:r>
+        <w:rPr>
+          <w:b/>
+          <w:bCs/>
+          <w:color w:val="EE0000"/>
+          <w:u w:val="single"/>
+        </w:rPr>
+        <w:t>cele</w:t>
+      </w:r>
+      <w:proofErr w:type="spellEnd"/>
+      <w:r>
+        <w:rPr>
+          <w:b/>
+          <w:bCs/>
+          <w:color w:val="EE0000"/>
+          <w:u w:val="single"/>
+        </w:rPr>
+        <w:t xml:space="preserve"> care sunt </w:t>
+      </w:r>
+      <w:proofErr w:type="spellStart"/>
+      <w:r>
+        <w:rPr>
+          <w:b/>
+          <w:bCs/>
+          <w:color w:val="EE0000"/>
+          <w:u w:val="single"/>
+        </w:rPr>
+        <w:t>facute</w:t>
+      </w:r>
+      <w:proofErr w:type="spellEnd"/>
+      <w:r>
+        <w:rPr>
+          <w:b/>
+          <w:bCs/>
+          <w:color w:val="EE0000"/>
+          <w:u w:val="single"/>
+        </w:rPr>
+        <w:t xml:space="preserve"> </w:t>
+      </w:r>
+      <w:proofErr w:type="spellStart"/>
+      <w:r>
+        <w:rPr>
+          <w:b/>
+          <w:bCs/>
+          <w:color w:val="EE0000"/>
+          <w:u w:val="single"/>
+        </w:rPr>
+        <w:t>pentru</w:t>
+      </w:r>
+      <w:proofErr w:type="spellEnd"/>
+      <w:r>
+        <w:rPr>
+          <w:b/>
+          <w:bCs/>
+          <w:color w:val="EE0000"/>
+          <w:u w:val="single"/>
+        </w:rPr>
+        <w:t xml:space="preserve"> </w:t>
+      </w:r>
+      <w:proofErr w:type="spellStart"/>
+      <w:r>
+        <w:rPr>
+          <w:b/>
+          <w:bCs/>
+          <w:color w:val="EE0000"/>
+          <w:u w:val="single"/>
+        </w:rPr>
+        <w:t>altii</w:t>
+      </w:r>
+      <w:proofErr w:type="spellEnd"/>
+      <w:r>
+        <w:rPr>
+          <w:b/>
+          <w:bCs/>
+          <w:color w:val="EE0000"/>
+          <w:u w:val="single"/>
+        </w:rPr>
+        <w:t xml:space="preserve"> (</w:t>
+      </w:r>
+      <w:proofErr w:type="spellStart"/>
+      <w:r>
+        <w:rPr>
+          <w:b/>
+          <w:bCs/>
+          <w:color w:val="EE0000"/>
+          <w:u w:val="single"/>
+        </w:rPr>
+        <w:t>Programari</w:t>
+      </w:r>
+      <w:proofErr w:type="spellEnd"/>
+      <w:r>
+        <w:rPr>
+          <w:b/>
+          <w:bCs/>
+          <w:color w:val="EE0000"/>
+          <w:u w:val="single"/>
+        </w:rPr>
+        <w:t xml:space="preserve"> </w:t>
+      </w:r>
+      <w:proofErr w:type="spellStart"/>
+      <w:r>
+        <w:rPr>
+          <w:b/>
+          <w:bCs/>
+          <w:color w:val="EE0000"/>
+          <w:u w:val="single"/>
+        </w:rPr>
+        <w:t>pentru</w:t>
+      </w:r>
+      <w:proofErr w:type="spellEnd"/>
+      <w:r>
+        <w:rPr>
+          <w:b/>
+          <w:bCs/>
+          <w:color w:val="EE0000"/>
+          <w:u w:val="single"/>
+        </w:rPr>
+        <w:t xml:space="preserve"> </w:t>
+      </w:r>
+      <w:proofErr w:type="spellStart"/>
+      <w:r>
+        <w:rPr>
+          <w:b/>
+          <w:bCs/>
+          <w:color w:val="EE0000"/>
+          <w:u w:val="single"/>
+        </w:rPr>
+        <w:t>altii</w:t>
+      </w:r>
+      <w:proofErr w:type="spellEnd"/>
+      <w:r>
+        <w:rPr>
+          <w:b/>
+          <w:bCs/>
+          <w:color w:val="EE0000"/>
+          <w:u w:val="single"/>
+        </w:rPr>
+        <w:t>)</w:t>
+      </w:r>
+    </w:p>
+    <w:p>
+      <w:pPr>
+        <w:ind w:left="1080"/>
+        <w:jc w:val="center"/>
+        <w:rPr>
+          <w:b/>
+          <w:bCs/>
+          <w:color w:val="EE0000"/>
+          <w:u w:val="single"/>
+        </w:rPr>
+      </w:pPr>
+      <w:r>
+        <w:drawing>
+          <wp:inline distT="0" distB="0" distL="0" distR="0" wp14:anchorId="46FA44D6" wp14:editId="064A9A56">
+            <wp:extent cx="4076993" cy="3855720"/>
+            <wp:effectExtent l="0" t="0" r="0" b="0"/>
+            <wp:docPr id="433343220" name="Picture 1"/>
+            <wp:cNvGraphicFramePr>
+              <a:graphicFrameLocks xmlns:a="http://schemas.openxmlformats.org/drawingml/2006/main" noChangeAspect="1"/>
+            </wp:cNvGraphicFramePr>
+            <a:graphic xmlns:a="http://schemas.openxmlformats.org/drawingml/2006/main">
+              <a:graphicData uri="http://schemas.openxmlformats.org/drawingml/2006/picture">
+                <pic:pic xmlns:pic="http://schemas.openxmlformats.org/drawingml/2006/picture">
+                  <pic:nvPicPr>
+                    <pic:cNvPr id="433343220" name=""/>
+                    <pic:cNvPicPr/>
+                  </pic:nvPicPr>
+                  <pic:blipFill>
+                    <a:blip r:embed="rId10"/>
+                    <a:stretch>
+                      <a:fillRect/>
+                    </a:stretch>
+                  </pic:blipFill>
+                  <pic:spPr>
+                    <a:xfrm>
+                      <a:off x="0" y="0"/>
+                      <a:ext cx="4095080" cy="3872826"/>
+                    </a:xfrm>
+                    <a:prstGeom prst="rect">
+                      <a:avLst/>
+                    </a:prstGeom>
+                  </pic:spPr>
+                </pic:pic>
+              </a:graphicData>
+            </a:graphic>
+          </wp:inline>
+        </w:drawing>
+      </w:r>
+    </w:p>
+    <w:p>
+      <w:pPr>
+        <w:ind w:left="360"/>
+      </w:pPr>
+    </w:p>
+    <w:p>
+      <w:pPr>
+        <w:ind w:left="360"/>
+      </w:pPr>
+    </w:p>
+    <w:p>
+      <w:pPr>
+        <w:pStyle w:val="ListParagraph"/>
+        <w:numPr>
+          <w:ilvl w:val="0"/>
+          <w:numId w:val="15"/>
+        </w:numPr>
+      </w:pPr>
+      <w:r>
+        <w:rPr>
+          <w:b/>
+          <w:bCs/>
+          <w:highlight w:val="green"/>
+        </w:rPr>
+        <w:t>DONE</w:t>
+      </w:r>
+      <w:r>
+        <w:rPr>
+          <w:b/>
+          <w:bCs/>
+        </w:rPr>
+        <w:t xml:space="preserve"> </w:t>
+      </w:r>
+      <w:proofErr w:type="spellStart"/>
+      <w:r>
+        <w:t>Politica</w:t>
+      </w:r>
+      <w:proofErr w:type="spellEnd"/>
+      <w:r>
+        <w:t xml:space="preserve"> de </w:t>
+      </w:r>
+      <w:proofErr w:type="spellStart"/>
+      <w:r>
+        <w:t>confidetnialitate</w:t>
+      </w:r>
+      <w:proofErr w:type="spellEnd"/>
+      <w:r>
+        <w:t xml:space="preserve"> ---- </w:t>
+      </w:r>
+      <w:proofErr w:type="spellStart"/>
+      <w:r>
+        <w:t>lipseste</w:t>
+      </w:r>
+      <w:proofErr w:type="spellEnd"/>
+      <w:r>
+        <w:t xml:space="preserve"> SCROLL UP/DOWN</w:t>
+      </w:r>
+    </w:p>
+    <w:p>
+      <w:pPr>
+        <w:pStyle w:val="ListParagraph"/>
+        <w:numPr>
+          <w:ilvl w:val="0"/>
+          <w:numId w:val="15"/>
+        </w:numPr>
+      </w:pPr>
+      <w:r>
+        <w:rPr>
+          <w:b/>
+          <w:bCs/>
+          <w:highlight w:val="green"/>
+        </w:rPr>
+        <w:t>DONE</w:t>
+      </w:r>
+      <w:r>
+        <w:rPr>
+          <w:b/>
+          <w:bCs/>
+        </w:rPr>
+        <w:t xml:space="preserve"> </w:t>
+      </w:r>
       <w:r>
         <w:t xml:space="preserve">Da </w:t>
       </w:r>
@@ -60,8 +2702,13 @@
       </w:r>
       <w:proofErr w:type="spellEnd"/>
       <w:r>
-        <w:t xml:space="preserve"> contului</w:t>
-      </w:r>
+        <w:t xml:space="preserve"> </w:t>
+      </w:r>
+      <w:proofErr w:type="spellStart"/>
+      <w:r>
+        <w:t>contului</w:t>
+      </w:r>
+      <w:proofErr w:type="spellEnd"/>
     </w:p>
     <w:p>
       <w:pPr>
@@ -110,7 +2757,7 @@
                     <pic:cNvPicPr/>
                   </pic:nvPicPr>
                   <pic:blipFill>
-                    <a:blip r:embed="rId5"/>
+                    <a:blip r:embed="rId11"/>
                     <a:stretch>
                       <a:fillRect/>
                     </a:stretch>
@@ -894,7 +3541,6 @@
         <w:rPr>
           <w:noProof/>
         </w:rPr>
-        <w:lastRenderedPageBreak/>
         <w:drawing>
           <wp:inline distT="0" distB="0" distL="0" distR="0" wp14:anchorId="3F1B9F8A" wp14:editId="2FAE0B87">
             <wp:extent cx="5303520" cy="3591208"/>
@@ -911,7 +3557,7 @@
                     <pic:cNvPicPr/>
                   </pic:nvPicPr>
                   <pic:blipFill>
-                    <a:blip r:embed="rId6"/>
+                    <a:blip r:embed="rId12"/>
                     <a:stretch>
                       <a:fillRect/>
                     </a:stretch>
@@ -2012,6 +4658,7 @@
           <w:i/>
           <w:iCs/>
         </w:rPr>
+        <w:lastRenderedPageBreak/>
         <w:t>starea</w:t>
       </w:r>
       <w:proofErr w:type="spellEnd"/>
@@ -2435,7 +5082,6 @@
         <w:rPr>
           <w:noProof/>
         </w:rPr>
-        <w:lastRenderedPageBreak/>
         <w:drawing>
           <wp:inline distT="0" distB="0" distL="0" distR="0" wp14:anchorId="4ED858DC" wp14:editId="1B9CF6EC">
             <wp:extent cx="3528441" cy="3360420"/>
@@ -2452,7 +5098,7 @@
                     <pic:cNvPicPr/>
                   </pic:nvPicPr>
                   <pic:blipFill>
-                    <a:blip r:embed="rId7"/>
+                    <a:blip r:embed="rId13"/>
                     <a:stretch>
                       <a:fillRect/>
                     </a:stretch>
@@ -2626,7 +5272,7 @@
                     <pic:cNvPicPr/>
                   </pic:nvPicPr>
                   <pic:blipFill>
-                    <a:blip r:embed="rId8"/>
+                    <a:blip r:embed="rId14"/>
                     <a:stretch>
                       <a:fillRect/>
                     </a:stretch>
@@ -2707,6 +5353,7 @@
         <w:rPr>
           <w:noProof/>
         </w:rPr>
+        <w:lastRenderedPageBreak/>
         <w:drawing>
           <wp:inline distT="0" distB="0" distL="0" distR="0" wp14:anchorId="22DA5CAF" wp14:editId="6F20B605">
             <wp:extent cx="1962430" cy="2080260"/>
@@ -2723,7 +5370,7 @@
                     <pic:cNvPicPr/>
                   </pic:nvPicPr>
                   <pic:blipFill>
-                    <a:blip r:embed="rId9"/>
+                    <a:blip r:embed="rId15"/>
                     <a:stretch>
                       <a:fillRect/>
                     </a:stretch>
@@ -3028,7 +5675,6 @@
       </w:r>
       <w:proofErr w:type="spellStart"/>
       <w:r>
-        <w:lastRenderedPageBreak/>
         <w:t>acelasi</w:t>
       </w:r>
       <w:proofErr w:type="spellEnd"/>
@@ -3209,7 +5855,7 @@
                     <pic:cNvPicPr/>
                   </pic:nvPicPr>
                   <pic:blipFill>
-                    <a:blip r:embed="rId10"/>
+                    <a:blip r:embed="rId16"/>
                     <a:stretch>
                       <a:fillRect/>
                     </a:stretch>
@@ -3451,7 +6097,7 @@
                     <pic:cNvPicPr/>
                   </pic:nvPicPr>
                   <pic:blipFill>
-                    <a:blip r:embed="rId11"/>
+                    <a:blip r:embed="rId17"/>
                     <a:stretch>
                       <a:fillRect/>
                     </a:stretch>
@@ -3795,6 +6441,7 @@
       </w:r>
       <w:proofErr w:type="spellStart"/>
       <w:r>
+        <w:lastRenderedPageBreak/>
         <w:t>trebuie</w:t>
       </w:r>
       <w:proofErr w:type="spellEnd"/>
@@ -4088,7 +6735,7 @@
                     <pic:cNvPicPr/>
                   </pic:nvPicPr>
                   <pic:blipFill>
-                    <a:blip r:embed="rId9"/>
+                    <a:blip r:embed="rId15"/>
                     <a:stretch>
                       <a:fillRect/>
                     </a:stretch>
@@ -4175,7 +6822,6 @@
         </w:numPr>
       </w:pPr>
       <w:r>
-        <w:lastRenderedPageBreak/>
         <w:t xml:space="preserve">Din </w:t>
       </w:r>
       <w:proofErr w:type="spellStart"/>
@@ -6352,6 +8998,7 @@
       </w:r>
       <w:proofErr w:type="spellStart"/>
       <w:r>
+        <w:lastRenderedPageBreak/>
         <w:t>dumneavoastră</w:t>
       </w:r>
       <w:proofErr w:type="spellEnd"/>
@@ -7346,7 +9993,6 @@
       </w:pPr>
       <w:proofErr w:type="spellStart"/>
       <w:r>
-        <w:lastRenderedPageBreak/>
         <w:t>Dreptul</w:t>
       </w:r>
       <w:proofErr w:type="spellEnd"/>
@@ -8674,6 +11320,7 @@
         <w:rPr>
           <w:noProof/>
         </w:rPr>
+        <w:lastRenderedPageBreak/>
         <w:drawing>
           <wp:inline distT="0" distB="0" distL="0" distR="0" wp14:anchorId="518212A2" wp14:editId="00DF060E">
             <wp:extent cx="1946066" cy="2788920"/>
@@ -8690,7 +11337,7 @@
                     <pic:cNvPicPr/>
                   </pic:nvPicPr>
                   <pic:blipFill>
-                    <a:blip r:embed="rId12"/>
+                    <a:blip r:embed="rId18"/>
                     <a:stretch>
                       <a:fillRect/>
                     </a:stretch>
@@ -8733,7 +11380,7 @@
                     <pic:cNvPicPr/>
                   </pic:nvPicPr>
                   <pic:blipFill>
-                    <a:blip r:embed="rId13"/>
+                    <a:blip r:embed="rId19"/>
                     <a:stretch>
                       <a:fillRect/>
                     </a:stretch>
@@ -8826,7 +11473,7 @@
                     <pic:cNvPicPr/>
                   </pic:nvPicPr>
                   <pic:blipFill>
-                    <a:blip r:embed="rId14"/>
+                    <a:blip r:embed="rId20"/>
                     <a:stretch>
                       <a:fillRect/>
                     </a:stretch>
@@ -10324,7 +12971,7 @@
         <w:rFonts w:ascii="Calibri" w:eastAsiaTheme="minorHAnsi" w:hAnsi="Calibri" w:cs="Calibri" w:hint="default"/>
       </w:rPr>
     </w:lvl>
-    <w:lvl w:ilvl="1" w:tplc="08090003" w:tentative="1">
+    <w:lvl w:ilvl="1" w:tplc="08090003">
       <w:start w:val="1"/>
       <w:numFmt w:val="bullet"/>
       <w:lvlText w:val="o"/>
@@ -11386,6 +14033,22 @@
       <w:spacing w:val="5"/>
     </w:rPr>
   </w:style>
+  <w:style w:type="paragraph" w:customStyle="1" w:styleId="x1ghz6dp">
+    <w:name w:val="x1ghz6dp"/>
+    <w:basedOn w:val="Normal"/>
+    <w:rsid w:val="00192BBB"/>
+    <w:pPr>
+      <w:spacing w:before="100" w:beforeAutospacing="1" w:after="100" w:afterAutospacing="1" w:line="240" w:lineRule="auto"/>
+    </w:pPr>
+    <w:rPr>
+      <w:rFonts w:ascii="Times New Roman" w:eastAsia="Times New Roman" w:hAnsi="Times New Roman" w:cs="Times New Roman"/>
+      <w:kern w:val="0"/>
+      <w:sz w:val="24"/>
+      <w:szCs w:val="24"/>
+      <w:lang w:eastAsia="en-GB"/>
+      <w14:ligatures w14:val="none"/>
+    </w:rPr>
+  </w:style>
 </w:styles>
 </file>
 

</xml_diff>

<commit_message>
interface update for mobile
</commit_message>
<xml_diff>
--- a/Testare_rezultate_1.docx
+++ b/Testare_rezultate_1.docx
@@ -1892,6 +1892,25 @@
           <w:u w:val="single"/>
         </w:rPr>
       </w:pPr>
+      <w:r>
+        <w:rPr>
+          <w:b/>
+          <w:bCs/>
+          <w:color w:val="EE0000"/>
+          <w:highlight w:val="green"/>
+          <w:u w:val="single"/>
+        </w:rPr>
+        <w:t>DONE</w:t>
+      </w:r>
+      <w:r>
+        <w:rPr>
+          <w:b/>
+          <w:bCs/>
+          <w:color w:val="EE0000"/>
+          <w:u w:val="single"/>
+        </w:rPr>
+        <w:t xml:space="preserve"> </w:t>
+      </w:r>
       <w:r>
         <w:rPr>
           <w:b/>

</xml_diff>